<commit_message>
Agrego Ejercicios 18 a 23 inclusive.
Hice los ejercicios del 18 al 23 inclusive. Falta del 11 al 17 inclusive
</commit_message>
<xml_diff>
--- a/tps/tp2/Grupo7/TP 2 parte teorica-Grupo7.docx
+++ b/tps/tp2/Grupo7/TP 2 parte teorica-Grupo7.docx
@@ -13,6 +13,7 @@
           <w:szCs w:val="28"/>
         </w:rPr>
       </w:pPr>
+      <w:proofErr w:type="spellStart"/>
       <w:r>
         <w:rPr>
           <w:rFonts w:ascii="Arial" w:hAnsi="Arial" w:cs="Arial"/>
@@ -21,12 +22,10 @@
           <w:sz w:val="28"/>
           <w:szCs w:val="28"/>
         </w:rPr>
-        <w:t>Programacion y Estructura de datos</w:t>
-      </w:r>
-    </w:p>
-    <w:p>
-      <w:pPr>
-        <w:jc w:val="center"/>
+        <w:t>Programacion</w:t>
+      </w:r>
+      <w:proofErr w:type="spellEnd"/>
+      <w:r>
         <w:rPr>
           <w:rFonts w:ascii="Arial" w:hAnsi="Arial" w:cs="Arial"/>
           <w:b/>
@@ -34,8 +33,12 @@
           <w:sz w:val="28"/>
           <w:szCs w:val="28"/>
         </w:rPr>
-      </w:pPr>
-      <w:r>
+        <w:t xml:space="preserve"> y Estructura de datos</w:t>
+      </w:r>
+    </w:p>
+    <w:p>
+      <w:pPr>
+        <w:jc w:val="center"/>
         <w:rPr>
           <w:rFonts w:ascii="Arial" w:hAnsi="Arial" w:cs="Arial"/>
           <w:b/>
@@ -43,12 +46,8 @@
           <w:sz w:val="28"/>
           <w:szCs w:val="28"/>
         </w:rPr>
-        <w:t>Maximiliano Coedo</w:t>
-      </w:r>
-    </w:p>
-    <w:p>
-      <w:pPr>
-        <w:jc w:val="center"/>
+      </w:pPr>
+      <w:r>
         <w:rPr>
           <w:rFonts w:ascii="Arial" w:hAnsi="Arial" w:cs="Arial"/>
           <w:b/>
@@ -56,8 +55,12 @@
           <w:sz w:val="28"/>
           <w:szCs w:val="28"/>
         </w:rPr>
-      </w:pPr>
-      <w:r>
+        <w:t>Maximiliano Coedo</w:t>
+      </w:r>
+    </w:p>
+    <w:p>
+      <w:pPr>
+        <w:jc w:val="center"/>
         <w:rPr>
           <w:rFonts w:ascii="Arial" w:hAnsi="Arial" w:cs="Arial"/>
           <w:b/>
@@ -65,8 +68,7 @@
           <w:sz w:val="28"/>
           <w:szCs w:val="28"/>
         </w:rPr>
-        <w:t>Trabajo práctico</w:t>
-      </w:r>
+      </w:pPr>
       <w:r>
         <w:rPr>
           <w:rFonts w:ascii="Arial" w:hAnsi="Arial" w:cs="Arial"/>
@@ -75,12 +77,9 @@
           <w:sz w:val="28"/>
           <w:szCs w:val="28"/>
         </w:rPr>
-        <w:t xml:space="preserve"> N°2 </w:t>
-      </w:r>
-    </w:p>
-    <w:p>
-      <w:pPr>
-        <w:jc w:val="center"/>
+        <w:t>Trabajo práctico</w:t>
+      </w:r>
+      <w:r>
         <w:rPr>
           <w:rFonts w:ascii="Arial" w:hAnsi="Arial" w:cs="Arial"/>
           <w:b/>
@@ -88,8 +87,12 @@
           <w:sz w:val="28"/>
           <w:szCs w:val="28"/>
         </w:rPr>
-      </w:pPr>
-      <w:r>
+        <w:t xml:space="preserve"> N°2 </w:t>
+      </w:r>
+    </w:p>
+    <w:p>
+      <w:pPr>
+        <w:jc w:val="center"/>
         <w:rPr>
           <w:rFonts w:ascii="Arial" w:hAnsi="Arial" w:cs="Arial"/>
           <w:b/>
@@ -97,6 +100,15 @@
           <w:sz w:val="28"/>
           <w:szCs w:val="28"/>
         </w:rPr>
+      </w:pPr>
+      <w:r>
+        <w:rPr>
+          <w:rFonts w:ascii="Arial" w:hAnsi="Arial" w:cs="Arial"/>
+          <w:b/>
+          <w:bCs/>
+          <w:sz w:val="28"/>
+          <w:szCs w:val="28"/>
+        </w:rPr>
         <w:t>Grupo 7</w:t>
       </w:r>
     </w:p>
@@ -138,11 +150,10 @@
           <w:sz w:val="26"/>
           <w:szCs w:val="26"/>
         </w:rPr>
-        <w:t>, Bernarda Pantozi, Thomas Perez Rollo, Ramiro Vicente.</w:t>
-      </w:r>
-    </w:p>
-    <w:p>
-      <w:pPr>
+        <w:t xml:space="preserve">, Bernarda Pantozi, Thomas </w:t>
+      </w:r>
+      <w:proofErr w:type="spellStart"/>
+      <w:r>
         <w:rPr>
           <w:rFonts w:ascii="Arial" w:hAnsi="Arial" w:cs="Arial"/>
           <w:b/>
@@ -150,6 +161,29 @@
           <w:sz w:val="26"/>
           <w:szCs w:val="26"/>
         </w:rPr>
+        <w:t>Perez</w:t>
+      </w:r>
+      <w:proofErr w:type="spellEnd"/>
+      <w:r>
+        <w:rPr>
+          <w:rFonts w:ascii="Arial" w:hAnsi="Arial" w:cs="Arial"/>
+          <w:b/>
+          <w:bCs/>
+          <w:sz w:val="26"/>
+          <w:szCs w:val="26"/>
+        </w:rPr>
+        <w:t xml:space="preserve"> Rollo, Ramiro Vicente.</w:t>
+      </w:r>
+    </w:p>
+    <w:p>
+      <w:pPr>
+        <w:rPr>
+          <w:rFonts w:ascii="Arial" w:hAnsi="Arial" w:cs="Arial"/>
+          <w:b/>
+          <w:bCs/>
+          <w:sz w:val="26"/>
+          <w:szCs w:val="26"/>
+        </w:rPr>
       </w:pPr>
     </w:p>
     <w:p>
@@ -170,6 +204,7 @@
           <w:bCs/>
         </w:rPr>
       </w:pPr>
+      <w:proofErr w:type="gramStart"/>
       <w:r>
         <w:rPr>
           <w:rFonts w:ascii="Arial" w:hAnsi="Arial" w:cs="Arial"/>
@@ -184,7 +219,16 @@
           <w:b/>
           <w:bCs/>
         </w:rPr>
-        <w:t>¿Qué característica posee la programación visual</w:t>
+        <w:t>¿</w:t>
+      </w:r>
+      <w:proofErr w:type="gramEnd"/>
+      <w:r>
+        <w:rPr>
+          <w:rFonts w:ascii="Arial" w:hAnsi="Arial" w:cs="Arial"/>
+          <w:b/>
+          <w:bCs/>
+        </w:rPr>
+        <w:t>Qué característica posee la programación visual</w:t>
       </w:r>
     </w:p>
     <w:p>
@@ -204,7 +248,35 @@
         <w:rPr>
           <w:rFonts w:ascii="Arial" w:hAnsi="Arial" w:cs="Arial"/>
         </w:rPr>
-        <w:t>Una de las principales características de la programación visual es que le permite al usuario diseñar la interfaz gráfica arrastrando y soltando desde la ToolBox hasta el formulario, ubicarlo sin escribir manualmente la posición en la que queres ubicar el control. Se separa el diseño del código que hace el programador, además, favorece al desarrollo rápido de aplicaciones y la reutilización de componentes ya probados.</w:t>
+        <w:t xml:space="preserve">Una de las principales características de la programación visual es que le permite al usuario diseñar la interfaz gráfica arrastrando y soltando desde la </w:t>
+      </w:r>
+      <w:proofErr w:type="spellStart"/>
+      <w:r>
+        <w:rPr>
+          <w:rFonts w:ascii="Arial" w:hAnsi="Arial" w:cs="Arial"/>
+        </w:rPr>
+        <w:t>ToolBox</w:t>
+      </w:r>
+      <w:proofErr w:type="spellEnd"/>
+      <w:r>
+        <w:rPr>
+          <w:rFonts w:ascii="Arial" w:hAnsi="Arial" w:cs="Arial"/>
+        </w:rPr>
+        <w:t xml:space="preserve"> hasta el formulario, ubicarlo sin escribir manualmente la posición en la que </w:t>
+      </w:r>
+      <w:proofErr w:type="spellStart"/>
+      <w:r>
+        <w:rPr>
+          <w:rFonts w:ascii="Arial" w:hAnsi="Arial" w:cs="Arial"/>
+        </w:rPr>
+        <w:t>queres</w:t>
+      </w:r>
+      <w:proofErr w:type="spellEnd"/>
+      <w:r>
+        <w:rPr>
+          <w:rFonts w:ascii="Arial" w:hAnsi="Arial" w:cs="Arial"/>
+        </w:rPr>
+        <w:t xml:space="preserve"> ubicar el control. Se separa el diseño del código que hace el programador, además, favorece al desarrollo rápido de aplicaciones y la reutilización de componentes ya probados.</w:t>
       </w:r>
     </w:p>
     <w:p>
@@ -325,7 +397,37 @@
         <w:rPr>
           <w:rFonts w:ascii="Arial" w:hAnsi="Arial" w:cs="Arial"/>
         </w:rPr>
-        <w:t>Eventos: Reacciones ante un contexto, por ejemplo, que debe hacer si le das click derecho o si le pasa el mouse por encima.</w:t>
+        <w:t xml:space="preserve">Eventos: Reacciones ante un contexto, por ejemplo, que debe hacer si le das </w:t>
+      </w:r>
+      <w:proofErr w:type="spellStart"/>
+      <w:proofErr w:type="gramStart"/>
+      <w:r>
+        <w:rPr>
+          <w:rFonts w:ascii="Arial" w:hAnsi="Arial" w:cs="Arial"/>
+        </w:rPr>
+        <w:t>click</w:t>
+      </w:r>
+      <w:proofErr w:type="spellEnd"/>
+      <w:proofErr w:type="gramEnd"/>
+      <w:r>
+        <w:rPr>
+          <w:rFonts w:ascii="Arial" w:hAnsi="Arial" w:cs="Arial"/>
+        </w:rPr>
+        <w:t xml:space="preserve"> derecho o si le pasa el </w:t>
+      </w:r>
+      <w:proofErr w:type="gramStart"/>
+      <w:r>
+        <w:rPr>
+          <w:rFonts w:ascii="Arial" w:hAnsi="Arial" w:cs="Arial"/>
+        </w:rPr>
+        <w:t>mouse</w:t>
+      </w:r>
+      <w:proofErr w:type="gramEnd"/>
+      <w:r>
+        <w:rPr>
+          <w:rFonts w:ascii="Arial" w:hAnsi="Arial" w:cs="Arial"/>
+        </w:rPr>
+        <w:t xml:space="preserve"> por encima.</w:t>
       </w:r>
     </w:p>
     <w:p>
@@ -343,7 +445,25 @@
           <w:bCs/>
         </w:rPr>
         <w:br/>
-        <w:t>4. ¿Para qué se utiliza la ventana denominada Solution Explorer?</w:t>
+        <w:t xml:space="preserve">4. ¿Para qué se utiliza la ventana denominada </w:t>
+      </w:r>
+      <w:proofErr w:type="spellStart"/>
+      <w:r>
+        <w:rPr>
+          <w:rFonts w:ascii="Arial" w:hAnsi="Arial" w:cs="Arial"/>
+          <w:b/>
+          <w:bCs/>
+        </w:rPr>
+        <w:t>Solution</w:t>
+      </w:r>
+      <w:proofErr w:type="spellEnd"/>
+      <w:r>
+        <w:rPr>
+          <w:rFonts w:ascii="Arial" w:hAnsi="Arial" w:cs="Arial"/>
+          <w:b/>
+          <w:bCs/>
+        </w:rPr>
+        <w:t xml:space="preserve"> Explorer?</w:t>
       </w:r>
     </w:p>
     <w:p>
@@ -361,41 +481,103 @@
         <w:rPr>
           <w:rFonts w:ascii="Arial" w:hAnsi="Arial" w:cs="Arial"/>
         </w:rPr>
-        <w:t xml:space="preserve">El Solution Explorer(Explorador de soluciones) es que te muestra la estructura de los archivos con los que está trabajando el usuario. </w:t>
+        <w:t xml:space="preserve">El </w:t>
+      </w:r>
+      <w:proofErr w:type="spellStart"/>
+      <w:r>
+        <w:rPr>
+          <w:rFonts w:ascii="Arial" w:hAnsi="Arial" w:cs="Arial"/>
+        </w:rPr>
+        <w:t>Solution</w:t>
+      </w:r>
+      <w:proofErr w:type="spellEnd"/>
+      <w:r>
+        <w:rPr>
+          <w:rFonts w:ascii="Arial" w:hAnsi="Arial" w:cs="Arial"/>
+        </w:rPr>
+        <w:t xml:space="preserve"> </w:t>
+      </w:r>
+      <w:proofErr w:type="gramStart"/>
+      <w:r>
+        <w:rPr>
+          <w:rFonts w:ascii="Arial" w:hAnsi="Arial" w:cs="Arial"/>
+        </w:rPr>
+        <w:t>Explorer(</w:t>
+      </w:r>
+      <w:proofErr w:type="gramEnd"/>
+      <w:r>
+        <w:rPr>
+          <w:rFonts w:ascii="Arial" w:hAnsi="Arial" w:cs="Arial"/>
+        </w:rPr>
+        <w:t xml:space="preserve">Explorador de soluciones) es que te muestra la estructura de los archivos con los que está trabajando el usuario. </w:t>
       </w:r>
       <w:r>
         <w:rPr>
           <w:rFonts w:ascii="Arial" w:hAnsi="Arial" w:cs="Arial"/>
         </w:rPr>
         <w:lastRenderedPageBreak/>
-        <w:t>Muestra formularios, clases, referencias y recursos. Permite editar, agregar, eliminar, organizar archivos y carpetas del proyecto. Puede acceder rápidamente al código o diseño de un formulario, dando click derecho sobre el archivo .CS</w:t>
-      </w:r>
-    </w:p>
-    <w:p>
-      <w:pPr>
-        <w:pStyle w:val="Prrafodelista"/>
-        <w:rPr>
-          <w:rFonts w:ascii="Arial" w:hAnsi="Arial" w:cs="Arial"/>
-          <w:b/>
-          <w:bCs/>
-        </w:rPr>
-      </w:pPr>
-    </w:p>
-    <w:p>
-      <w:pPr>
-        <w:rPr>
-          <w:rFonts w:ascii="Arial" w:hAnsi="Arial" w:cs="Arial"/>
-          <w:b/>
-          <w:bCs/>
-        </w:rPr>
-      </w:pPr>
-      <w:r>
-        <w:rPr>
-          <w:rFonts w:ascii="Arial" w:hAnsi="Arial" w:cs="Arial"/>
-          <w:b/>
-          <w:bCs/>
-        </w:rPr>
-        <w:t>5. ¿Para qué se utiliza la ventana denominada Properties?</w:t>
+        <w:t xml:space="preserve">Muestra formularios, clases, referencias y recursos. Permite editar, agregar, eliminar, organizar archivos y carpetas del proyecto. Puede acceder rápidamente al código o diseño de un formulario, dando </w:t>
+      </w:r>
+      <w:proofErr w:type="spellStart"/>
+      <w:proofErr w:type="gramStart"/>
+      <w:r>
+        <w:rPr>
+          <w:rFonts w:ascii="Arial" w:hAnsi="Arial" w:cs="Arial"/>
+        </w:rPr>
+        <w:t>click</w:t>
+      </w:r>
+      <w:proofErr w:type="spellEnd"/>
+      <w:proofErr w:type="gramEnd"/>
+      <w:r>
+        <w:rPr>
+          <w:rFonts w:ascii="Arial" w:hAnsi="Arial" w:cs="Arial"/>
+        </w:rPr>
+        <w:t xml:space="preserve"> derecho sobre el archivo .CS</w:t>
+      </w:r>
+    </w:p>
+    <w:p>
+      <w:pPr>
+        <w:pStyle w:val="Prrafodelista"/>
+        <w:rPr>
+          <w:rFonts w:ascii="Arial" w:hAnsi="Arial" w:cs="Arial"/>
+          <w:b/>
+          <w:bCs/>
+        </w:rPr>
+      </w:pPr>
+    </w:p>
+    <w:p>
+      <w:pPr>
+        <w:rPr>
+          <w:rFonts w:ascii="Arial" w:hAnsi="Arial" w:cs="Arial"/>
+          <w:b/>
+          <w:bCs/>
+        </w:rPr>
+      </w:pPr>
+      <w:r>
+        <w:rPr>
+          <w:rFonts w:ascii="Arial" w:hAnsi="Arial" w:cs="Arial"/>
+          <w:b/>
+          <w:bCs/>
+        </w:rPr>
+        <w:t xml:space="preserve">5. ¿Para qué se utiliza la ventana denominada </w:t>
+      </w:r>
+      <w:proofErr w:type="spellStart"/>
+      <w:r>
+        <w:rPr>
+          <w:rFonts w:ascii="Arial" w:hAnsi="Arial" w:cs="Arial"/>
+          <w:b/>
+          <w:bCs/>
+        </w:rPr>
+        <w:t>Properties</w:t>
+      </w:r>
+      <w:proofErr w:type="spellEnd"/>
+      <w:r>
+        <w:rPr>
+          <w:rFonts w:ascii="Arial" w:hAnsi="Arial" w:cs="Arial"/>
+          <w:b/>
+          <w:bCs/>
+        </w:rPr>
+        <w:t>?</w:t>
       </w:r>
     </w:p>
     <w:p>
@@ -421,7 +603,21 @@
         <w:rPr>
           <w:rFonts w:ascii="Arial" w:hAnsi="Arial" w:cs="Arial"/>
         </w:rPr>
-        <w:t xml:space="preserve">configurar. Por ejemplo, el usuario puede seleccionar del objeto del cuadro de herramientas, se abre la ventana de todas las propiedades que tiene ese objeto y que se pueden modificar, como su tamaño, color, texto que muestra. También se puede ver las propiedades de archivos que seleccione en el Solution Explorer. </w:t>
+        <w:t xml:space="preserve">configurar. Por ejemplo, el usuario puede seleccionar del objeto del cuadro de herramientas, se abre la ventana de todas las propiedades que tiene ese objeto y que se pueden modificar, como su tamaño, color, texto que muestra. También se puede ver las propiedades de archivos que seleccione en el </w:t>
+      </w:r>
+      <w:proofErr w:type="spellStart"/>
+      <w:r>
+        <w:rPr>
+          <w:rFonts w:ascii="Arial" w:hAnsi="Arial" w:cs="Arial"/>
+        </w:rPr>
+        <w:t>Solution</w:t>
+      </w:r>
+      <w:proofErr w:type="spellEnd"/>
+      <w:r>
+        <w:rPr>
+          <w:rFonts w:ascii="Arial" w:hAnsi="Arial" w:cs="Arial"/>
+        </w:rPr>
+        <w:t xml:space="preserve"> Explorer. </w:t>
       </w:r>
       <w:r>
         <w:rPr>
@@ -444,7 +640,25 @@
           <w:b/>
           <w:bCs/>
         </w:rPr>
-        <w:t>6. ¿Para qué se utiliza la ventana denominada Toolbox?</w:t>
+        <w:t xml:space="preserve">6. ¿Para qué se utiliza la ventana denominada </w:t>
+      </w:r>
+      <w:proofErr w:type="spellStart"/>
+      <w:r>
+        <w:rPr>
+          <w:rFonts w:ascii="Arial" w:hAnsi="Arial" w:cs="Arial"/>
+          <w:b/>
+          <w:bCs/>
+        </w:rPr>
+        <w:t>Toolbox</w:t>
+      </w:r>
+      <w:proofErr w:type="spellEnd"/>
+      <w:r>
+        <w:rPr>
+          <w:rFonts w:ascii="Arial" w:hAnsi="Arial" w:cs="Arial"/>
+          <w:b/>
+          <w:bCs/>
+        </w:rPr>
+        <w:t>?</w:t>
       </w:r>
     </w:p>
     <w:p>
@@ -464,7 +678,37 @@
         <w:rPr>
           <w:rFonts w:ascii="Arial" w:hAnsi="Arial" w:cs="Arial"/>
         </w:rPr>
-        <w:t xml:space="preserve">El ToolBox o Cuadro de Herramientas contiene todos los controles que se pueden agregar al formulario simplemente arrastrándolo y ubicándolo donde quieras o dando doble click. </w:t>
+        <w:t xml:space="preserve">El </w:t>
+      </w:r>
+      <w:proofErr w:type="spellStart"/>
+      <w:r>
+        <w:rPr>
+          <w:rFonts w:ascii="Arial" w:hAnsi="Arial" w:cs="Arial"/>
+        </w:rPr>
+        <w:t>ToolBox</w:t>
+      </w:r>
+      <w:proofErr w:type="spellEnd"/>
+      <w:r>
+        <w:rPr>
+          <w:rFonts w:ascii="Arial" w:hAnsi="Arial" w:cs="Arial"/>
+        </w:rPr>
+        <w:t xml:space="preserve"> o Cuadro de Herramientas contiene todos los controles que se pueden agregar al formulario simplemente arrastrándolo y ubicándolo donde quieras o dando doble </w:t>
+      </w:r>
+      <w:proofErr w:type="spellStart"/>
+      <w:proofErr w:type="gramStart"/>
+      <w:r>
+        <w:rPr>
+          <w:rFonts w:ascii="Arial" w:hAnsi="Arial" w:cs="Arial"/>
+        </w:rPr>
+        <w:t>click</w:t>
+      </w:r>
+      <w:proofErr w:type="spellEnd"/>
+      <w:proofErr w:type="gramEnd"/>
+      <w:r>
+        <w:rPr>
+          <w:rFonts w:ascii="Arial" w:hAnsi="Arial" w:cs="Arial"/>
+        </w:rPr>
+        <w:t xml:space="preserve">. </w:t>
       </w:r>
     </w:p>
     <w:p>
@@ -538,7 +782,43 @@
         <w:rPr>
           <w:rFonts w:ascii="Arial" w:hAnsi="Arial" w:cs="Arial"/>
         </w:rPr>
-        <w:t>Un proyecto es la unidad que se compila, contiene los formularios, clases, recursos, referencias a bibliotecas y la configuración para generar un ejecutable. Cada proyecto tendrá su código(.cs), su diseño (.Designer.cs.resx) y referencias.</w:t>
+        <w:t>Un proyecto es la unidad que se compila, contiene los formularios, clases, recursos, referencias a bibliotecas y la configuración para generar un ejecutable. Cada proyecto tendrá su código(.</w:t>
+      </w:r>
+      <w:proofErr w:type="spellStart"/>
+      <w:r>
+        <w:rPr>
+          <w:rFonts w:ascii="Arial" w:hAnsi="Arial" w:cs="Arial"/>
+        </w:rPr>
+        <w:t>cs</w:t>
+      </w:r>
+      <w:proofErr w:type="spellEnd"/>
+      <w:r>
+        <w:rPr>
+          <w:rFonts w:ascii="Arial" w:hAnsi="Arial" w:cs="Arial"/>
+        </w:rPr>
+        <w:t xml:space="preserve">), su diseño </w:t>
+      </w:r>
+      <w:proofErr w:type="gramStart"/>
+      <w:r>
+        <w:rPr>
+          <w:rFonts w:ascii="Arial" w:hAnsi="Arial" w:cs="Arial"/>
+        </w:rPr>
+        <w:t>(.</w:t>
+      </w:r>
+      <w:proofErr w:type="spellStart"/>
+      <w:r>
+        <w:rPr>
+          <w:rFonts w:ascii="Arial" w:hAnsi="Arial" w:cs="Arial"/>
+        </w:rPr>
+        <w:t>Designer.cs.resx</w:t>
+      </w:r>
+      <w:proofErr w:type="spellEnd"/>
+      <w:proofErr w:type="gramEnd"/>
+      <w:r>
+        <w:rPr>
+          <w:rFonts w:ascii="Arial" w:hAnsi="Arial" w:cs="Arial"/>
+        </w:rPr>
+        <w:t>) y referencias.</w:t>
       </w:r>
     </w:p>
     <w:p>
@@ -582,7 +862,35 @@
         <w:rPr>
           <w:rFonts w:ascii="Arial" w:hAnsi="Arial" w:cs="Arial"/>
         </w:rPr>
-        <w:t>Toda aplicación WinForms tiene al menos un formulario principal, instanciado y mostrado desde Main() en Program.cs.</w:t>
+        <w:t xml:space="preserve">Toda aplicación WinForms tiene al menos un formulario principal, instanciado y mostrado desde </w:t>
+      </w:r>
+      <w:proofErr w:type="gramStart"/>
+      <w:r>
+        <w:rPr>
+          <w:rFonts w:ascii="Arial" w:hAnsi="Arial" w:cs="Arial"/>
+        </w:rPr>
+        <w:t>Main(</w:t>
+      </w:r>
+      <w:proofErr w:type="gramEnd"/>
+      <w:r>
+        <w:rPr>
+          <w:rFonts w:ascii="Arial" w:hAnsi="Arial" w:cs="Arial"/>
+        </w:rPr>
+        <w:t xml:space="preserve">) en </w:t>
+      </w:r>
+      <w:proofErr w:type="spellStart"/>
+      <w:r>
+        <w:rPr>
+          <w:rFonts w:ascii="Arial" w:hAnsi="Arial" w:cs="Arial"/>
+        </w:rPr>
+        <w:t>Program.cs</w:t>
+      </w:r>
+      <w:proofErr w:type="spellEnd"/>
+      <w:r>
+        <w:rPr>
+          <w:rFonts w:ascii="Arial" w:hAnsi="Arial" w:cs="Arial"/>
+        </w:rPr>
+        <w:t>.</w:t>
       </w:r>
       <w:r>
         <w:rPr>
@@ -716,13 +1024,23 @@
           <w:bCs/>
         </w:rPr>
       </w:pPr>
-      <w:r>
-        <w:rPr>
-          <w:rFonts w:ascii="Arial" w:hAnsi="Arial" w:cs="Arial"/>
-          <w:b/>
-          <w:bCs/>
-        </w:rPr>
-        <w:t xml:space="preserve">BackColor: </w:t>
+      <w:proofErr w:type="spellStart"/>
+      <w:r>
+        <w:rPr>
+          <w:rFonts w:ascii="Arial" w:hAnsi="Arial" w:cs="Arial"/>
+          <w:b/>
+          <w:bCs/>
+        </w:rPr>
+        <w:t>BackColor</w:t>
+      </w:r>
+      <w:proofErr w:type="spellEnd"/>
+      <w:r>
+        <w:rPr>
+          <w:rFonts w:ascii="Arial" w:hAnsi="Arial" w:cs="Arial"/>
+          <w:b/>
+          <w:bCs/>
+        </w:rPr>
+        <w:t xml:space="preserve">: </w:t>
       </w:r>
       <w:r>
         <w:rPr>
@@ -744,13 +1062,23 @@
           <w:bCs/>
         </w:rPr>
       </w:pPr>
-      <w:r>
-        <w:rPr>
-          <w:rFonts w:ascii="Arial" w:hAnsi="Arial" w:cs="Arial"/>
-          <w:b/>
-          <w:bCs/>
-        </w:rPr>
-        <w:t xml:space="preserve">ForeColor: </w:t>
+      <w:proofErr w:type="spellStart"/>
+      <w:r>
+        <w:rPr>
+          <w:rFonts w:ascii="Arial" w:hAnsi="Arial" w:cs="Arial"/>
+          <w:b/>
+          <w:bCs/>
+        </w:rPr>
+        <w:t>ForeColor</w:t>
+      </w:r>
+      <w:proofErr w:type="spellEnd"/>
+      <w:r>
+        <w:rPr>
+          <w:rFonts w:ascii="Arial" w:hAnsi="Arial" w:cs="Arial"/>
+          <w:b/>
+          <w:bCs/>
+        </w:rPr>
+        <w:t xml:space="preserve">: </w:t>
       </w:r>
       <w:r>
         <w:rPr>
@@ -828,13 +1156,23 @@
           <w:bCs/>
         </w:rPr>
       </w:pPr>
-      <w:r>
-        <w:rPr>
-          <w:rFonts w:ascii="Arial" w:hAnsi="Arial" w:cs="Arial"/>
-          <w:b/>
-          <w:bCs/>
-        </w:rPr>
-        <w:t xml:space="preserve">Location: </w:t>
+      <w:proofErr w:type="spellStart"/>
+      <w:r>
+        <w:rPr>
+          <w:rFonts w:ascii="Arial" w:hAnsi="Arial" w:cs="Arial"/>
+          <w:b/>
+          <w:bCs/>
+        </w:rPr>
+        <w:t>Location</w:t>
+      </w:r>
+      <w:proofErr w:type="spellEnd"/>
+      <w:r>
+        <w:rPr>
+          <w:rFonts w:ascii="Arial" w:hAnsi="Arial" w:cs="Arial"/>
+          <w:b/>
+          <w:bCs/>
+        </w:rPr>
+        <w:t xml:space="preserve">: </w:t>
       </w:r>
       <w:r>
         <w:rPr>
@@ -884,13 +1222,23 @@
           <w:bCs/>
         </w:rPr>
       </w:pPr>
-      <w:r>
-        <w:rPr>
-          <w:rFonts w:ascii="Arial" w:hAnsi="Arial" w:cs="Arial"/>
-          <w:b/>
-          <w:bCs/>
-        </w:rPr>
-        <w:t>Enabled:</w:t>
+      <w:proofErr w:type="spellStart"/>
+      <w:r>
+        <w:rPr>
+          <w:rFonts w:ascii="Arial" w:hAnsi="Arial" w:cs="Arial"/>
+          <w:b/>
+          <w:bCs/>
+        </w:rPr>
+        <w:t>Enabled</w:t>
+      </w:r>
+      <w:proofErr w:type="spellEnd"/>
+      <w:r>
+        <w:rPr>
+          <w:rFonts w:ascii="Arial" w:hAnsi="Arial" w:cs="Arial"/>
+          <w:b/>
+          <w:bCs/>
+        </w:rPr>
+        <w:t>:</w:t>
       </w:r>
       <w:r>
         <w:rPr>
@@ -912,19 +1260,43 @@
           <w:bCs/>
         </w:rPr>
       </w:pPr>
-      <w:r>
-        <w:rPr>
-          <w:rFonts w:ascii="Arial" w:hAnsi="Arial" w:cs="Arial"/>
-          <w:b/>
-          <w:bCs/>
-        </w:rPr>
-        <w:t xml:space="preserve">FlatStyle: </w:t>
-      </w:r>
-      <w:r>
-        <w:rPr>
-          <w:rFonts w:ascii="Arial" w:hAnsi="Arial" w:cs="Arial"/>
-        </w:rPr>
-        <w:t>Modifica el estilo visual ( ejemplo plano, estándar o con relieve).</w:t>
+      <w:proofErr w:type="spellStart"/>
+      <w:r>
+        <w:rPr>
+          <w:rFonts w:ascii="Arial" w:hAnsi="Arial" w:cs="Arial"/>
+          <w:b/>
+          <w:bCs/>
+        </w:rPr>
+        <w:t>FlatStyle</w:t>
+      </w:r>
+      <w:proofErr w:type="spellEnd"/>
+      <w:r>
+        <w:rPr>
+          <w:rFonts w:ascii="Arial" w:hAnsi="Arial" w:cs="Arial"/>
+          <w:b/>
+          <w:bCs/>
+        </w:rPr>
+        <w:t xml:space="preserve">: </w:t>
+      </w:r>
+      <w:r>
+        <w:rPr>
+          <w:rFonts w:ascii="Arial" w:hAnsi="Arial" w:cs="Arial"/>
+        </w:rPr>
+        <w:t xml:space="preserve">Modifica el estilo visual </w:t>
+      </w:r>
+      <w:proofErr w:type="gramStart"/>
+      <w:r>
+        <w:rPr>
+          <w:rFonts w:ascii="Arial" w:hAnsi="Arial" w:cs="Arial"/>
+        </w:rPr>
+        <w:t>( ejemplo</w:t>
+      </w:r>
+      <w:proofErr w:type="gramEnd"/>
+      <w:r>
+        <w:rPr>
+          <w:rFonts w:ascii="Arial" w:hAnsi="Arial" w:cs="Arial"/>
+        </w:rPr>
+        <w:t xml:space="preserve"> plano, estándar o con relieve).</w:t>
       </w:r>
     </w:p>
     <w:p>
@@ -962,13 +1334,33 @@
           <w:bCs/>
         </w:rPr>
       </w:pPr>
-      <w:r>
-        <w:rPr>
-          <w:rFonts w:ascii="Arial" w:hAnsi="Arial" w:cs="Arial"/>
-          <w:b/>
-          <w:bCs/>
-        </w:rPr>
-        <w:t>PerformClick():</w:t>
+      <w:proofErr w:type="spellStart"/>
+      <w:proofErr w:type="gramStart"/>
+      <w:r>
+        <w:rPr>
+          <w:rFonts w:ascii="Arial" w:hAnsi="Arial" w:cs="Arial"/>
+          <w:b/>
+          <w:bCs/>
+        </w:rPr>
+        <w:t>PerformClick</w:t>
+      </w:r>
+      <w:proofErr w:type="spellEnd"/>
+      <w:r>
+        <w:rPr>
+          <w:rFonts w:ascii="Arial" w:hAnsi="Arial" w:cs="Arial"/>
+          <w:b/>
+          <w:bCs/>
+        </w:rPr>
+        <w:t>(</w:t>
+      </w:r>
+      <w:proofErr w:type="gramEnd"/>
+      <w:r>
+        <w:rPr>
+          <w:rFonts w:ascii="Arial" w:hAnsi="Arial" w:cs="Arial"/>
+          <w:b/>
+          <w:bCs/>
+        </w:rPr>
+        <w:t>):</w:t>
       </w:r>
       <w:r>
         <w:rPr>
@@ -990,13 +1382,23 @@
           <w:bCs/>
         </w:rPr>
       </w:pPr>
-      <w:r>
-        <w:rPr>
-          <w:rFonts w:ascii="Arial" w:hAnsi="Arial" w:cs="Arial"/>
-          <w:b/>
-          <w:bCs/>
-        </w:rPr>
-        <w:t>Focus():</w:t>
+      <w:proofErr w:type="gramStart"/>
+      <w:r>
+        <w:rPr>
+          <w:rFonts w:ascii="Arial" w:hAnsi="Arial" w:cs="Arial"/>
+          <w:b/>
+          <w:bCs/>
+        </w:rPr>
+        <w:t>Focus(</w:t>
+      </w:r>
+      <w:proofErr w:type="gramEnd"/>
+      <w:r>
+        <w:rPr>
+          <w:rFonts w:ascii="Arial" w:hAnsi="Arial" w:cs="Arial"/>
+          <w:b/>
+          <w:bCs/>
+        </w:rPr>
+        <w:t>):</w:t>
       </w:r>
       <w:r>
         <w:rPr>
@@ -1018,13 +1420,33 @@
           <w:bCs/>
         </w:rPr>
       </w:pPr>
-      <w:r>
-        <w:rPr>
-          <w:rFonts w:ascii="Arial" w:hAnsi="Arial" w:cs="Arial"/>
-          <w:b/>
-          <w:bCs/>
-        </w:rPr>
-        <w:t>Select():</w:t>
+      <w:proofErr w:type="spellStart"/>
+      <w:proofErr w:type="gramStart"/>
+      <w:r>
+        <w:rPr>
+          <w:rFonts w:ascii="Arial" w:hAnsi="Arial" w:cs="Arial"/>
+          <w:b/>
+          <w:bCs/>
+        </w:rPr>
+        <w:t>Select</w:t>
+      </w:r>
+      <w:proofErr w:type="spellEnd"/>
+      <w:r>
+        <w:rPr>
+          <w:rFonts w:ascii="Arial" w:hAnsi="Arial" w:cs="Arial"/>
+          <w:b/>
+          <w:bCs/>
+        </w:rPr>
+        <w:t>(</w:t>
+      </w:r>
+      <w:proofErr w:type="gramEnd"/>
+      <w:r>
+        <w:rPr>
+          <w:rFonts w:ascii="Arial" w:hAnsi="Arial" w:cs="Arial"/>
+          <w:b/>
+          <w:bCs/>
+        </w:rPr>
+        <w:t>):</w:t>
       </w:r>
       <w:r>
         <w:rPr>
@@ -1058,13 +1480,33 @@
           <w:bCs/>
         </w:rPr>
       </w:pPr>
-      <w:r>
-        <w:rPr>
-          <w:rFonts w:ascii="Arial" w:hAnsi="Arial" w:cs="Arial"/>
-          <w:b/>
-          <w:bCs/>
-        </w:rPr>
-        <w:t>BringToFront():</w:t>
+      <w:proofErr w:type="spellStart"/>
+      <w:proofErr w:type="gramStart"/>
+      <w:r>
+        <w:rPr>
+          <w:rFonts w:ascii="Arial" w:hAnsi="Arial" w:cs="Arial"/>
+          <w:b/>
+          <w:bCs/>
+        </w:rPr>
+        <w:t>BringToFront</w:t>
+      </w:r>
+      <w:proofErr w:type="spellEnd"/>
+      <w:r>
+        <w:rPr>
+          <w:rFonts w:ascii="Arial" w:hAnsi="Arial" w:cs="Arial"/>
+          <w:b/>
+          <w:bCs/>
+        </w:rPr>
+        <w:t>(</w:t>
+      </w:r>
+      <w:proofErr w:type="gramEnd"/>
+      <w:r>
+        <w:rPr>
+          <w:rFonts w:ascii="Arial" w:hAnsi="Arial" w:cs="Arial"/>
+          <w:b/>
+          <w:bCs/>
+        </w:rPr>
+        <w:t>):</w:t>
       </w:r>
       <w:r>
         <w:rPr>
@@ -1098,13 +1540,33 @@
           <w:bCs/>
         </w:rPr>
       </w:pPr>
-      <w:r>
-        <w:rPr>
-          <w:rFonts w:ascii="Arial" w:hAnsi="Arial" w:cs="Arial"/>
-          <w:b/>
-          <w:bCs/>
-        </w:rPr>
-        <w:t>SendToBack():</w:t>
+      <w:proofErr w:type="spellStart"/>
+      <w:proofErr w:type="gramStart"/>
+      <w:r>
+        <w:rPr>
+          <w:rFonts w:ascii="Arial" w:hAnsi="Arial" w:cs="Arial"/>
+          <w:b/>
+          <w:bCs/>
+        </w:rPr>
+        <w:t>SendToBack</w:t>
+      </w:r>
+      <w:proofErr w:type="spellEnd"/>
+      <w:r>
+        <w:rPr>
+          <w:rFonts w:ascii="Arial" w:hAnsi="Arial" w:cs="Arial"/>
+          <w:b/>
+          <w:bCs/>
+        </w:rPr>
+        <w:t>(</w:t>
+      </w:r>
+      <w:proofErr w:type="gramEnd"/>
+      <w:r>
+        <w:rPr>
+          <w:rFonts w:ascii="Arial" w:hAnsi="Arial" w:cs="Arial"/>
+          <w:b/>
+          <w:bCs/>
+        </w:rPr>
+        <w:t>):</w:t>
       </w:r>
       <w:r>
         <w:rPr>
@@ -1144,13 +1606,23 @@
           <w:bCs/>
         </w:rPr>
       </w:pPr>
-      <w:r>
-        <w:rPr>
-          <w:rFonts w:ascii="Arial" w:hAnsi="Arial" w:cs="Arial"/>
-          <w:b/>
-          <w:bCs/>
-        </w:rPr>
-        <w:t xml:space="preserve">Hide(): </w:t>
+      <w:proofErr w:type="gramStart"/>
+      <w:r>
+        <w:rPr>
+          <w:rFonts w:ascii="Arial" w:hAnsi="Arial" w:cs="Arial"/>
+          <w:b/>
+          <w:bCs/>
+        </w:rPr>
+        <w:t>Hide(</w:t>
+      </w:r>
+      <w:proofErr w:type="gramEnd"/>
+      <w:r>
+        <w:rPr>
+          <w:rFonts w:ascii="Arial" w:hAnsi="Arial" w:cs="Arial"/>
+          <w:b/>
+          <w:bCs/>
+        </w:rPr>
+        <w:t xml:space="preserve">): </w:t>
       </w:r>
       <w:r>
         <w:rPr>
@@ -1172,13 +1644,23 @@
           <w:bCs/>
         </w:rPr>
       </w:pPr>
-      <w:r>
-        <w:rPr>
-          <w:rFonts w:ascii="Arial" w:hAnsi="Arial" w:cs="Arial"/>
-          <w:b/>
-          <w:bCs/>
-        </w:rPr>
-        <w:t xml:space="preserve">Show(): </w:t>
+      <w:proofErr w:type="gramStart"/>
+      <w:r>
+        <w:rPr>
+          <w:rFonts w:ascii="Arial" w:hAnsi="Arial" w:cs="Arial"/>
+          <w:b/>
+          <w:bCs/>
+        </w:rPr>
+        <w:t>Show(</w:t>
+      </w:r>
+      <w:proofErr w:type="gramEnd"/>
+      <w:r>
+        <w:rPr>
+          <w:rFonts w:ascii="Arial" w:hAnsi="Arial" w:cs="Arial"/>
+          <w:b/>
+          <w:bCs/>
+        </w:rPr>
+        <w:t xml:space="preserve">): </w:t>
       </w:r>
       <w:r>
         <w:rPr>
@@ -1200,13 +1682,33 @@
           <w:bCs/>
         </w:rPr>
       </w:pPr>
-      <w:r>
-        <w:rPr>
-          <w:rFonts w:ascii="Arial" w:hAnsi="Arial" w:cs="Arial"/>
-          <w:b/>
-          <w:bCs/>
-        </w:rPr>
-        <w:t>ResetBackColor():</w:t>
+      <w:proofErr w:type="spellStart"/>
+      <w:proofErr w:type="gramStart"/>
+      <w:r>
+        <w:rPr>
+          <w:rFonts w:ascii="Arial" w:hAnsi="Arial" w:cs="Arial"/>
+          <w:b/>
+          <w:bCs/>
+        </w:rPr>
+        <w:t>ResetBackColor</w:t>
+      </w:r>
+      <w:proofErr w:type="spellEnd"/>
+      <w:r>
+        <w:rPr>
+          <w:rFonts w:ascii="Arial" w:hAnsi="Arial" w:cs="Arial"/>
+          <w:b/>
+          <w:bCs/>
+        </w:rPr>
+        <w:t>(</w:t>
+      </w:r>
+      <w:proofErr w:type="gramEnd"/>
+      <w:r>
+        <w:rPr>
+          <w:rFonts w:ascii="Arial" w:hAnsi="Arial" w:cs="Arial"/>
+          <w:b/>
+          <w:bCs/>
+        </w:rPr>
+        <w:t>):</w:t>
       </w:r>
       <w:r>
         <w:rPr>
@@ -1240,13 +1742,33 @@
           <w:bCs/>
         </w:rPr>
       </w:pPr>
-      <w:r>
-        <w:rPr>
-          <w:rFonts w:ascii="Arial" w:hAnsi="Arial" w:cs="Arial"/>
-          <w:b/>
-          <w:bCs/>
-        </w:rPr>
-        <w:t xml:space="preserve">ResetForeColor(): </w:t>
+      <w:proofErr w:type="spellStart"/>
+      <w:proofErr w:type="gramStart"/>
+      <w:r>
+        <w:rPr>
+          <w:rFonts w:ascii="Arial" w:hAnsi="Arial" w:cs="Arial"/>
+          <w:b/>
+          <w:bCs/>
+        </w:rPr>
+        <w:t>ResetForeColor</w:t>
+      </w:r>
+      <w:proofErr w:type="spellEnd"/>
+      <w:r>
+        <w:rPr>
+          <w:rFonts w:ascii="Arial" w:hAnsi="Arial" w:cs="Arial"/>
+          <w:b/>
+          <w:bCs/>
+        </w:rPr>
+        <w:t>(</w:t>
+      </w:r>
+      <w:proofErr w:type="gramEnd"/>
+      <w:r>
+        <w:rPr>
+          <w:rFonts w:ascii="Arial" w:hAnsi="Arial" w:cs="Arial"/>
+          <w:b/>
+          <w:bCs/>
+        </w:rPr>
+        <w:t xml:space="preserve">): </w:t>
       </w:r>
       <w:r>
         <w:rPr>
@@ -1268,13 +1790,33 @@
           <w:bCs/>
         </w:rPr>
       </w:pPr>
-      <w:r>
-        <w:rPr>
-          <w:rFonts w:ascii="Arial" w:hAnsi="Arial" w:cs="Arial"/>
-          <w:b/>
-          <w:bCs/>
-        </w:rPr>
-        <w:t>Dispose():</w:t>
+      <w:proofErr w:type="spellStart"/>
+      <w:proofErr w:type="gramStart"/>
+      <w:r>
+        <w:rPr>
+          <w:rFonts w:ascii="Arial" w:hAnsi="Arial" w:cs="Arial"/>
+          <w:b/>
+          <w:bCs/>
+        </w:rPr>
+        <w:t>Dispose</w:t>
+      </w:r>
+      <w:proofErr w:type="spellEnd"/>
+      <w:r>
+        <w:rPr>
+          <w:rFonts w:ascii="Arial" w:hAnsi="Arial" w:cs="Arial"/>
+          <w:b/>
+          <w:bCs/>
+        </w:rPr>
+        <w:t>(</w:t>
+      </w:r>
+      <w:proofErr w:type="gramEnd"/>
+      <w:r>
+        <w:rPr>
+          <w:rFonts w:ascii="Arial" w:hAnsi="Arial" w:cs="Arial"/>
+          <w:b/>
+          <w:bCs/>
+        </w:rPr>
+        <w:t>):</w:t>
       </w:r>
       <w:r>
         <w:rPr>
@@ -1318,13 +1860,23 @@
           <w:bCs/>
         </w:rPr>
       </w:pPr>
-      <w:r>
-        <w:rPr>
-          <w:rFonts w:ascii="Arial" w:hAnsi="Arial" w:cs="Arial"/>
-          <w:b/>
-          <w:bCs/>
-        </w:rPr>
-        <w:t xml:space="preserve">Click: </w:t>
+      <w:proofErr w:type="gramStart"/>
+      <w:r>
+        <w:rPr>
+          <w:rFonts w:ascii="Arial" w:hAnsi="Arial" w:cs="Arial"/>
+          <w:b/>
+          <w:bCs/>
+        </w:rPr>
+        <w:t>Click</w:t>
+      </w:r>
+      <w:proofErr w:type="gramEnd"/>
+      <w:r>
+        <w:rPr>
+          <w:rFonts w:ascii="Arial" w:hAnsi="Arial" w:cs="Arial"/>
+          <w:b/>
+          <w:bCs/>
+        </w:rPr>
+        <w:t xml:space="preserve">: </w:t>
       </w:r>
       <w:r>
         <w:rPr>
@@ -1346,19 +1898,43 @@
           <w:bCs/>
         </w:rPr>
       </w:pPr>
-      <w:r>
-        <w:rPr>
-          <w:rFonts w:ascii="Arial" w:hAnsi="Arial" w:cs="Arial"/>
-          <w:b/>
-          <w:bCs/>
-        </w:rPr>
-        <w:t xml:space="preserve">MouseEnter: </w:t>
-      </w:r>
-      <w:r>
-        <w:rPr>
-          <w:rFonts w:ascii="Arial" w:hAnsi="Arial" w:cs="Arial"/>
-        </w:rPr>
-        <w:t>Ocurre cuando el puntero del mouse entra en el área del botón.</w:t>
+      <w:proofErr w:type="spellStart"/>
+      <w:r>
+        <w:rPr>
+          <w:rFonts w:ascii="Arial" w:hAnsi="Arial" w:cs="Arial"/>
+          <w:b/>
+          <w:bCs/>
+        </w:rPr>
+        <w:t>MouseEnter</w:t>
+      </w:r>
+      <w:proofErr w:type="spellEnd"/>
+      <w:r>
+        <w:rPr>
+          <w:rFonts w:ascii="Arial" w:hAnsi="Arial" w:cs="Arial"/>
+          <w:b/>
+          <w:bCs/>
+        </w:rPr>
+        <w:t xml:space="preserve">: </w:t>
+      </w:r>
+      <w:r>
+        <w:rPr>
+          <w:rFonts w:ascii="Arial" w:hAnsi="Arial" w:cs="Arial"/>
+        </w:rPr>
+        <w:t xml:space="preserve">Ocurre cuando el puntero del </w:t>
+      </w:r>
+      <w:proofErr w:type="gramStart"/>
+      <w:r>
+        <w:rPr>
+          <w:rFonts w:ascii="Arial" w:hAnsi="Arial" w:cs="Arial"/>
+        </w:rPr>
+        <w:t>mouse</w:t>
+      </w:r>
+      <w:proofErr w:type="gramEnd"/>
+      <w:r>
+        <w:rPr>
+          <w:rFonts w:ascii="Arial" w:hAnsi="Arial" w:cs="Arial"/>
+        </w:rPr>
+        <w:t xml:space="preserve"> entra en el área del botón.</w:t>
       </w:r>
     </w:p>
     <w:p>
@@ -1374,19 +1950,43 @@
           <w:bCs/>
         </w:rPr>
       </w:pPr>
-      <w:r>
-        <w:rPr>
-          <w:rFonts w:ascii="Arial" w:hAnsi="Arial" w:cs="Arial"/>
-          <w:b/>
-          <w:bCs/>
-        </w:rPr>
-        <w:t xml:space="preserve">MouseLeave: </w:t>
-      </w:r>
-      <w:r>
-        <w:rPr>
-          <w:rFonts w:ascii="Arial" w:hAnsi="Arial" w:cs="Arial"/>
-        </w:rPr>
-        <w:t>Se dispara cuando el puntero del mouse sale del área del botón.</w:t>
+      <w:proofErr w:type="spellStart"/>
+      <w:r>
+        <w:rPr>
+          <w:rFonts w:ascii="Arial" w:hAnsi="Arial" w:cs="Arial"/>
+          <w:b/>
+          <w:bCs/>
+        </w:rPr>
+        <w:t>MouseLeave</w:t>
+      </w:r>
+      <w:proofErr w:type="spellEnd"/>
+      <w:r>
+        <w:rPr>
+          <w:rFonts w:ascii="Arial" w:hAnsi="Arial" w:cs="Arial"/>
+          <w:b/>
+          <w:bCs/>
+        </w:rPr>
+        <w:t xml:space="preserve">: </w:t>
+      </w:r>
+      <w:r>
+        <w:rPr>
+          <w:rFonts w:ascii="Arial" w:hAnsi="Arial" w:cs="Arial"/>
+        </w:rPr>
+        <w:t xml:space="preserve">Se dispara cuando el puntero del </w:t>
+      </w:r>
+      <w:proofErr w:type="gramStart"/>
+      <w:r>
+        <w:rPr>
+          <w:rFonts w:ascii="Arial" w:hAnsi="Arial" w:cs="Arial"/>
+        </w:rPr>
+        <w:t>mouse</w:t>
+      </w:r>
+      <w:proofErr w:type="gramEnd"/>
+      <w:r>
+        <w:rPr>
+          <w:rFonts w:ascii="Arial" w:hAnsi="Arial" w:cs="Arial"/>
+        </w:rPr>
+        <w:t xml:space="preserve"> sale del área del botón.</w:t>
       </w:r>
     </w:p>
     <w:p>
@@ -1402,6 +2002,7 @@
           <w:bCs/>
         </w:rPr>
       </w:pPr>
+      <w:proofErr w:type="spellStart"/>
       <w:r>
         <w:rPr>
           <w:rFonts w:ascii="Arial" w:hAnsi="Arial" w:cs="Arial"/>
@@ -1409,13 +2010,36 @@
           <w:bCs/>
         </w:rPr>
         <w:lastRenderedPageBreak/>
-        <w:t xml:space="preserve">MouseDown: </w:t>
-      </w:r>
-      <w:r>
-        <w:rPr>
-          <w:rFonts w:ascii="Arial" w:hAnsi="Arial" w:cs="Arial"/>
-        </w:rPr>
-        <w:t>Se ejecuta en el instante en que el usuario presiona cualquier botón del mouse sobre el control.</w:t>
+        <w:t>MouseDown</w:t>
+      </w:r>
+      <w:proofErr w:type="spellEnd"/>
+      <w:r>
+        <w:rPr>
+          <w:rFonts w:ascii="Arial" w:hAnsi="Arial" w:cs="Arial"/>
+          <w:b/>
+          <w:bCs/>
+        </w:rPr>
+        <w:t xml:space="preserve">: </w:t>
+      </w:r>
+      <w:r>
+        <w:rPr>
+          <w:rFonts w:ascii="Arial" w:hAnsi="Arial" w:cs="Arial"/>
+        </w:rPr>
+        <w:t xml:space="preserve">Se ejecuta en el instante en que el usuario presiona cualquier botón del </w:t>
+      </w:r>
+      <w:proofErr w:type="gramStart"/>
+      <w:r>
+        <w:rPr>
+          <w:rFonts w:ascii="Arial" w:hAnsi="Arial" w:cs="Arial"/>
+        </w:rPr>
+        <w:t>mouse</w:t>
+      </w:r>
+      <w:proofErr w:type="gramEnd"/>
+      <w:r>
+        <w:rPr>
+          <w:rFonts w:ascii="Arial" w:hAnsi="Arial" w:cs="Arial"/>
+        </w:rPr>
+        <w:t xml:space="preserve"> sobre el control.</w:t>
       </w:r>
     </w:p>
     <w:p>
@@ -1431,19 +2055,43 @@
           <w:bCs/>
         </w:rPr>
       </w:pPr>
-      <w:r>
-        <w:rPr>
-          <w:rFonts w:ascii="Arial" w:hAnsi="Arial" w:cs="Arial"/>
-          <w:b/>
-          <w:bCs/>
-        </w:rPr>
-        <w:t xml:space="preserve">MouseUp: </w:t>
-      </w:r>
-      <w:r>
-        <w:rPr>
-          <w:rFonts w:ascii="Arial" w:hAnsi="Arial" w:cs="Arial"/>
-        </w:rPr>
-        <w:t>Ocurre cuando el usuario suelta el botón del mouse que estaba presionando.</w:t>
+      <w:proofErr w:type="spellStart"/>
+      <w:r>
+        <w:rPr>
+          <w:rFonts w:ascii="Arial" w:hAnsi="Arial" w:cs="Arial"/>
+          <w:b/>
+          <w:bCs/>
+        </w:rPr>
+        <w:t>MouseUp</w:t>
+      </w:r>
+      <w:proofErr w:type="spellEnd"/>
+      <w:r>
+        <w:rPr>
+          <w:rFonts w:ascii="Arial" w:hAnsi="Arial" w:cs="Arial"/>
+          <w:b/>
+          <w:bCs/>
+        </w:rPr>
+        <w:t xml:space="preserve">: </w:t>
+      </w:r>
+      <w:r>
+        <w:rPr>
+          <w:rFonts w:ascii="Arial" w:hAnsi="Arial" w:cs="Arial"/>
+        </w:rPr>
+        <w:t xml:space="preserve">Ocurre cuando el usuario suelta el botón del </w:t>
+      </w:r>
+      <w:proofErr w:type="gramStart"/>
+      <w:r>
+        <w:rPr>
+          <w:rFonts w:ascii="Arial" w:hAnsi="Arial" w:cs="Arial"/>
+        </w:rPr>
+        <w:t>mouse</w:t>
+      </w:r>
+      <w:proofErr w:type="gramEnd"/>
+      <w:r>
+        <w:rPr>
+          <w:rFonts w:ascii="Arial" w:hAnsi="Arial" w:cs="Arial"/>
+        </w:rPr>
+        <w:t xml:space="preserve"> que estaba presionando.</w:t>
       </w:r>
     </w:p>
     <w:p>
@@ -1459,13 +2107,23 @@
           <w:bCs/>
         </w:rPr>
       </w:pPr>
-      <w:r>
-        <w:rPr>
-          <w:rFonts w:ascii="Arial" w:hAnsi="Arial" w:cs="Arial"/>
-          <w:b/>
-          <w:bCs/>
-        </w:rPr>
-        <w:t xml:space="preserve">GotFocus: </w:t>
+      <w:proofErr w:type="spellStart"/>
+      <w:r>
+        <w:rPr>
+          <w:rFonts w:ascii="Arial" w:hAnsi="Arial" w:cs="Arial"/>
+          <w:b/>
+          <w:bCs/>
+        </w:rPr>
+        <w:t>GotFocus</w:t>
+      </w:r>
+      <w:proofErr w:type="spellEnd"/>
+      <w:r>
+        <w:rPr>
+          <w:rFonts w:ascii="Arial" w:hAnsi="Arial" w:cs="Arial"/>
+          <w:b/>
+          <w:bCs/>
+        </w:rPr>
+        <w:t xml:space="preserve">: </w:t>
       </w:r>
       <w:r>
         <w:rPr>
@@ -1487,13 +2145,23 @@
           <w:bCs/>
         </w:rPr>
       </w:pPr>
-      <w:r>
-        <w:rPr>
-          <w:rFonts w:ascii="Arial" w:hAnsi="Arial" w:cs="Arial"/>
-          <w:b/>
-          <w:bCs/>
-        </w:rPr>
-        <w:t xml:space="preserve">LostFocus: </w:t>
+      <w:proofErr w:type="spellStart"/>
+      <w:r>
+        <w:rPr>
+          <w:rFonts w:ascii="Arial" w:hAnsi="Arial" w:cs="Arial"/>
+          <w:b/>
+          <w:bCs/>
+        </w:rPr>
+        <w:t>LostFocus</w:t>
+      </w:r>
+      <w:proofErr w:type="spellEnd"/>
+      <w:r>
+        <w:rPr>
+          <w:rFonts w:ascii="Arial" w:hAnsi="Arial" w:cs="Arial"/>
+          <w:b/>
+          <w:bCs/>
+        </w:rPr>
+        <w:t xml:space="preserve">: </w:t>
       </w:r>
       <w:r>
         <w:rPr>
@@ -1515,13 +2183,23 @@
           <w:bCs/>
         </w:rPr>
       </w:pPr>
-      <w:r>
-        <w:rPr>
-          <w:rFonts w:ascii="Arial" w:hAnsi="Arial" w:cs="Arial"/>
-          <w:b/>
-          <w:bCs/>
-        </w:rPr>
-        <w:t xml:space="preserve">KeyDown: </w:t>
+      <w:proofErr w:type="spellStart"/>
+      <w:r>
+        <w:rPr>
+          <w:rFonts w:ascii="Arial" w:hAnsi="Arial" w:cs="Arial"/>
+          <w:b/>
+          <w:bCs/>
+        </w:rPr>
+        <w:t>KeyDown</w:t>
+      </w:r>
+      <w:proofErr w:type="spellEnd"/>
+      <w:r>
+        <w:rPr>
+          <w:rFonts w:ascii="Arial" w:hAnsi="Arial" w:cs="Arial"/>
+          <w:b/>
+          <w:bCs/>
+        </w:rPr>
+        <w:t xml:space="preserve">: </w:t>
       </w:r>
       <w:r>
         <w:rPr>
@@ -1543,13 +2221,23 @@
           <w:bCs/>
         </w:rPr>
       </w:pPr>
-      <w:r>
-        <w:rPr>
-          <w:rFonts w:ascii="Arial" w:hAnsi="Arial" w:cs="Arial"/>
-          <w:b/>
-          <w:bCs/>
-        </w:rPr>
-        <w:t xml:space="preserve">KeyUp: </w:t>
+      <w:proofErr w:type="spellStart"/>
+      <w:r>
+        <w:rPr>
+          <w:rFonts w:ascii="Arial" w:hAnsi="Arial" w:cs="Arial"/>
+          <w:b/>
+          <w:bCs/>
+        </w:rPr>
+        <w:t>KeyUp</w:t>
+      </w:r>
+      <w:proofErr w:type="spellEnd"/>
+      <w:r>
+        <w:rPr>
+          <w:rFonts w:ascii="Arial" w:hAnsi="Arial" w:cs="Arial"/>
+          <w:b/>
+          <w:bCs/>
+        </w:rPr>
+        <w:t xml:space="preserve">: </w:t>
       </w:r>
       <w:r>
         <w:rPr>
@@ -1571,13 +2259,23 @@
           <w:bCs/>
         </w:rPr>
       </w:pPr>
-      <w:r>
-        <w:rPr>
-          <w:rFonts w:ascii="Arial" w:hAnsi="Arial" w:cs="Arial"/>
-          <w:b/>
-          <w:bCs/>
-        </w:rPr>
-        <w:t xml:space="preserve">TextChanged: </w:t>
+      <w:proofErr w:type="spellStart"/>
+      <w:r>
+        <w:rPr>
+          <w:rFonts w:ascii="Arial" w:hAnsi="Arial" w:cs="Arial"/>
+          <w:b/>
+          <w:bCs/>
+        </w:rPr>
+        <w:t>TextChanged</w:t>
+      </w:r>
+      <w:proofErr w:type="spellEnd"/>
+      <w:r>
+        <w:rPr>
+          <w:rFonts w:ascii="Arial" w:hAnsi="Arial" w:cs="Arial"/>
+          <w:b/>
+          <w:bCs/>
+        </w:rPr>
+        <w:t xml:space="preserve">: </w:t>
       </w:r>
       <w:r>
         <w:rPr>
@@ -1601,7 +2299,25 @@
           <w:bCs/>
         </w:rPr>
         <w:br/>
-        <w:t>11. Describa al menos 10 propiedades, 10 métodos y 10 eventos del control CheckBox.</w:t>
+        <w:t xml:space="preserve">11. Describa al menos 10 propiedades, 10 métodos y 10 eventos del control </w:t>
+      </w:r>
+      <w:proofErr w:type="spellStart"/>
+      <w:r>
+        <w:rPr>
+          <w:rFonts w:ascii="Arial" w:hAnsi="Arial" w:cs="Arial"/>
+          <w:b/>
+          <w:bCs/>
+        </w:rPr>
+        <w:t>CheckBox</w:t>
+      </w:r>
+      <w:proofErr w:type="spellEnd"/>
+      <w:r>
+        <w:rPr>
+          <w:rFonts w:ascii="Arial" w:hAnsi="Arial" w:cs="Arial"/>
+          <w:b/>
+          <w:bCs/>
+        </w:rPr>
+        <w:t>.</w:t>
       </w:r>
     </w:p>
     <w:p>
@@ -1639,13 +2355,23 @@
           <w:bCs/>
         </w:rPr>
       </w:pPr>
-      <w:r>
-        <w:rPr>
-          <w:rFonts w:ascii="Arial" w:hAnsi="Arial" w:cs="Arial"/>
-          <w:b/>
-          <w:bCs/>
-        </w:rPr>
-        <w:t xml:space="preserve">Checked: </w:t>
+      <w:proofErr w:type="spellStart"/>
+      <w:r>
+        <w:rPr>
+          <w:rFonts w:ascii="Arial" w:hAnsi="Arial" w:cs="Arial"/>
+          <w:b/>
+          <w:bCs/>
+        </w:rPr>
+        <w:t>Checked</w:t>
+      </w:r>
+      <w:proofErr w:type="spellEnd"/>
+      <w:r>
+        <w:rPr>
+          <w:rFonts w:ascii="Arial" w:hAnsi="Arial" w:cs="Arial"/>
+          <w:b/>
+          <w:bCs/>
+        </w:rPr>
+        <w:t xml:space="preserve">: </w:t>
       </w:r>
       <w:r>
         <w:rPr>
@@ -1667,19 +2393,71 @@
           <w:bCs/>
         </w:rPr>
       </w:pPr>
-      <w:r>
-        <w:rPr>
-          <w:rFonts w:ascii="Arial" w:hAnsi="Arial" w:cs="Arial"/>
-          <w:b/>
-          <w:bCs/>
-        </w:rPr>
-        <w:t xml:space="preserve">ChechState: </w:t>
-      </w:r>
-      <w:r>
-        <w:rPr>
-          <w:rFonts w:ascii="Arial" w:hAnsi="Arial" w:cs="Arial"/>
-        </w:rPr>
-        <w:t>Define el estado exacto, Checked (Marcado), Unckecked (Desmarcado) o indeterminate (indeterminado).</w:t>
+      <w:proofErr w:type="spellStart"/>
+      <w:r>
+        <w:rPr>
+          <w:rFonts w:ascii="Arial" w:hAnsi="Arial" w:cs="Arial"/>
+          <w:b/>
+          <w:bCs/>
+        </w:rPr>
+        <w:t>ChechState</w:t>
+      </w:r>
+      <w:proofErr w:type="spellEnd"/>
+      <w:r>
+        <w:rPr>
+          <w:rFonts w:ascii="Arial" w:hAnsi="Arial" w:cs="Arial"/>
+          <w:b/>
+          <w:bCs/>
+        </w:rPr>
+        <w:t xml:space="preserve">: </w:t>
+      </w:r>
+      <w:r>
+        <w:rPr>
+          <w:rFonts w:ascii="Arial" w:hAnsi="Arial" w:cs="Arial"/>
+        </w:rPr>
+        <w:t xml:space="preserve">Define el estado exacto, </w:t>
+      </w:r>
+      <w:proofErr w:type="spellStart"/>
+      <w:r>
+        <w:rPr>
+          <w:rFonts w:ascii="Arial" w:hAnsi="Arial" w:cs="Arial"/>
+        </w:rPr>
+        <w:t>Checked</w:t>
+      </w:r>
+      <w:proofErr w:type="spellEnd"/>
+      <w:r>
+        <w:rPr>
+          <w:rFonts w:ascii="Arial" w:hAnsi="Arial" w:cs="Arial"/>
+        </w:rPr>
+        <w:t xml:space="preserve"> (Marcado), </w:t>
+      </w:r>
+      <w:proofErr w:type="spellStart"/>
+      <w:r>
+        <w:rPr>
+          <w:rFonts w:ascii="Arial" w:hAnsi="Arial" w:cs="Arial"/>
+        </w:rPr>
+        <w:t>Unckecked</w:t>
+      </w:r>
+      <w:proofErr w:type="spellEnd"/>
+      <w:r>
+        <w:rPr>
+          <w:rFonts w:ascii="Arial" w:hAnsi="Arial" w:cs="Arial"/>
+        </w:rPr>
+        <w:t xml:space="preserve"> (Desmarcado) o </w:t>
+      </w:r>
+      <w:proofErr w:type="spellStart"/>
+      <w:r>
+        <w:rPr>
+          <w:rFonts w:ascii="Arial" w:hAnsi="Arial" w:cs="Arial"/>
+        </w:rPr>
+        <w:t>indeterminate</w:t>
+      </w:r>
+      <w:proofErr w:type="spellEnd"/>
+      <w:r>
+        <w:rPr>
+          <w:rFonts w:ascii="Arial" w:hAnsi="Arial" w:cs="Arial"/>
+        </w:rPr>
+        <w:t xml:space="preserve"> (indeterminado).</w:t>
       </w:r>
     </w:p>
     <w:p>
@@ -1695,13 +2473,23 @@
           <w:bCs/>
         </w:rPr>
       </w:pPr>
-      <w:r>
-        <w:rPr>
-          <w:rFonts w:ascii="Arial" w:hAnsi="Arial" w:cs="Arial"/>
-          <w:b/>
-          <w:bCs/>
-        </w:rPr>
-        <w:t xml:space="preserve">ThreeState: </w:t>
+      <w:proofErr w:type="spellStart"/>
+      <w:r>
+        <w:rPr>
+          <w:rFonts w:ascii="Arial" w:hAnsi="Arial" w:cs="Arial"/>
+          <w:b/>
+          <w:bCs/>
+        </w:rPr>
+        <w:t>ThreeState</w:t>
+      </w:r>
+      <w:proofErr w:type="spellEnd"/>
+      <w:r>
+        <w:rPr>
+          <w:rFonts w:ascii="Arial" w:hAnsi="Arial" w:cs="Arial"/>
+          <w:b/>
+          <w:bCs/>
+        </w:rPr>
+        <w:t xml:space="preserve">: </w:t>
       </w:r>
       <w:r>
         <w:rPr>
@@ -1751,13 +2539,23 @@
           <w:bCs/>
         </w:rPr>
       </w:pPr>
-      <w:r>
-        <w:rPr>
-          <w:rFonts w:ascii="Arial" w:hAnsi="Arial" w:cs="Arial"/>
-          <w:b/>
-          <w:bCs/>
-        </w:rPr>
-        <w:t xml:space="preserve">CheckAlign: </w:t>
+      <w:proofErr w:type="spellStart"/>
+      <w:r>
+        <w:rPr>
+          <w:rFonts w:ascii="Arial" w:hAnsi="Arial" w:cs="Arial"/>
+          <w:b/>
+          <w:bCs/>
+        </w:rPr>
+        <w:t>CheckAlign</w:t>
+      </w:r>
+      <w:proofErr w:type="spellEnd"/>
+      <w:r>
+        <w:rPr>
+          <w:rFonts w:ascii="Arial" w:hAnsi="Arial" w:cs="Arial"/>
+          <w:b/>
+          <w:bCs/>
+        </w:rPr>
+        <w:t xml:space="preserve">: </w:t>
       </w:r>
       <w:r>
         <w:rPr>
@@ -1779,13 +2577,23 @@
           <w:bCs/>
         </w:rPr>
       </w:pPr>
-      <w:r>
-        <w:rPr>
-          <w:rFonts w:ascii="Arial" w:hAnsi="Arial" w:cs="Arial"/>
-          <w:b/>
-          <w:bCs/>
-        </w:rPr>
-        <w:t xml:space="preserve">Appearance: </w:t>
+      <w:proofErr w:type="spellStart"/>
+      <w:r>
+        <w:rPr>
+          <w:rFonts w:ascii="Arial" w:hAnsi="Arial" w:cs="Arial"/>
+          <w:b/>
+          <w:bCs/>
+        </w:rPr>
+        <w:t>Appearance</w:t>
+      </w:r>
+      <w:proofErr w:type="spellEnd"/>
+      <w:r>
+        <w:rPr>
+          <w:rFonts w:ascii="Arial" w:hAnsi="Arial" w:cs="Arial"/>
+          <w:b/>
+          <w:bCs/>
+        </w:rPr>
+        <w:t xml:space="preserve">: </w:t>
       </w:r>
       <w:r>
         <w:rPr>
@@ -1847,13 +2655,23 @@
           <w:bCs/>
         </w:rPr>
       </w:pPr>
-      <w:r>
-        <w:rPr>
-          <w:rFonts w:ascii="Arial" w:hAnsi="Arial" w:cs="Arial"/>
-          <w:b/>
-          <w:bCs/>
-        </w:rPr>
-        <w:t xml:space="preserve">Enabled: </w:t>
+      <w:proofErr w:type="spellStart"/>
+      <w:r>
+        <w:rPr>
+          <w:rFonts w:ascii="Arial" w:hAnsi="Arial" w:cs="Arial"/>
+          <w:b/>
+          <w:bCs/>
+        </w:rPr>
+        <w:t>Enabled</w:t>
+      </w:r>
+      <w:proofErr w:type="spellEnd"/>
+      <w:r>
+        <w:rPr>
+          <w:rFonts w:ascii="Arial" w:hAnsi="Arial" w:cs="Arial"/>
+          <w:b/>
+          <w:bCs/>
+        </w:rPr>
+        <w:t xml:space="preserve">: </w:t>
       </w:r>
       <w:r>
         <w:rPr>
@@ -1875,13 +2693,23 @@
           <w:bCs/>
         </w:rPr>
       </w:pPr>
-      <w:r>
-        <w:rPr>
-          <w:rFonts w:ascii="Arial" w:hAnsi="Arial" w:cs="Arial"/>
-          <w:b/>
-          <w:bCs/>
-        </w:rPr>
-        <w:t xml:space="preserve">AutoCheck: </w:t>
+      <w:proofErr w:type="spellStart"/>
+      <w:r>
+        <w:rPr>
+          <w:rFonts w:ascii="Arial" w:hAnsi="Arial" w:cs="Arial"/>
+          <w:b/>
+          <w:bCs/>
+        </w:rPr>
+        <w:t>AutoCheck</w:t>
+      </w:r>
+      <w:proofErr w:type="spellEnd"/>
+      <w:r>
+        <w:rPr>
+          <w:rFonts w:ascii="Arial" w:hAnsi="Arial" w:cs="Arial"/>
+          <w:b/>
+          <w:bCs/>
+        </w:rPr>
+        <w:t xml:space="preserve">: </w:t>
       </w:r>
       <w:r>
         <w:rPr>
@@ -1903,13 +2731,23 @@
           <w:bCs/>
         </w:rPr>
       </w:pPr>
-      <w:r>
-        <w:rPr>
-          <w:rFonts w:ascii="Arial" w:hAnsi="Arial" w:cs="Arial"/>
-          <w:b/>
-          <w:bCs/>
-        </w:rPr>
-        <w:t xml:space="preserve">FlatStyle: </w:t>
+      <w:proofErr w:type="spellStart"/>
+      <w:r>
+        <w:rPr>
+          <w:rFonts w:ascii="Arial" w:hAnsi="Arial" w:cs="Arial"/>
+          <w:b/>
+          <w:bCs/>
+        </w:rPr>
+        <w:t>FlatStyle</w:t>
+      </w:r>
+      <w:proofErr w:type="spellEnd"/>
+      <w:r>
+        <w:rPr>
+          <w:rFonts w:ascii="Arial" w:hAnsi="Arial" w:cs="Arial"/>
+          <w:b/>
+          <w:bCs/>
+        </w:rPr>
+        <w:t xml:space="preserve">: </w:t>
       </w:r>
       <w:r>
         <w:rPr>
@@ -2006,6 +2844,7 @@
           <w:bCs/>
         </w:rPr>
       </w:pPr>
+      <w:proofErr w:type="spellStart"/>
       <w:r>
         <w:rPr>
           <w:rFonts w:ascii="Arial" w:hAnsi="Arial" w:cs="Arial"/>
@@ -2015,6 +2854,7 @@
         <w:lastRenderedPageBreak/>
         <w:t>Select</w:t>
       </w:r>
+      <w:proofErr w:type="spellEnd"/>
       <w:r>
         <w:rPr>
           <w:rFonts w:ascii="Arial" w:hAnsi="Arial" w:cs="Arial"/>
@@ -2051,6 +2891,7 @@
           <w:bCs/>
         </w:rPr>
       </w:pPr>
+      <w:proofErr w:type="spellStart"/>
       <w:r>
         <w:rPr>
           <w:rFonts w:ascii="Arial" w:hAnsi="Arial" w:cs="Arial"/>
@@ -2059,6 +2900,7 @@
         </w:rPr>
         <w:t>ResetText</w:t>
       </w:r>
+      <w:proofErr w:type="spellEnd"/>
       <w:r>
         <w:rPr>
           <w:rFonts w:ascii="Arial" w:hAnsi="Arial" w:cs="Arial"/>
@@ -2095,6 +2937,7 @@
           <w:bCs/>
         </w:rPr>
       </w:pPr>
+      <w:proofErr w:type="spellStart"/>
       <w:r>
         <w:rPr>
           <w:rFonts w:ascii="Arial" w:hAnsi="Arial" w:cs="Arial"/>
@@ -2103,6 +2946,7 @@
         </w:rPr>
         <w:t>BringToFront</w:t>
       </w:r>
+      <w:proofErr w:type="spellEnd"/>
       <w:r>
         <w:rPr>
           <w:rFonts w:ascii="Arial" w:hAnsi="Arial" w:cs="Arial"/>
@@ -2139,6 +2983,7 @@
           <w:bCs/>
         </w:rPr>
       </w:pPr>
+      <w:proofErr w:type="spellStart"/>
       <w:r>
         <w:rPr>
           <w:rFonts w:ascii="Arial" w:hAnsi="Arial" w:cs="Arial"/>
@@ -2147,6 +2992,7 @@
         </w:rPr>
         <w:t>SendToBack</w:t>
       </w:r>
+      <w:proofErr w:type="spellEnd"/>
       <w:r>
         <w:rPr>
           <w:rFonts w:ascii="Arial" w:hAnsi="Arial" w:cs="Arial"/>
@@ -2219,13 +3065,23 @@
           <w:bCs/>
         </w:rPr>
       </w:pPr>
-      <w:r>
-        <w:rPr>
-          <w:rFonts w:ascii="Arial" w:hAnsi="Arial" w:cs="Arial"/>
-          <w:b/>
-          <w:bCs/>
-        </w:rPr>
-        <w:t>Show (</w:t>
+      <w:proofErr w:type="gramStart"/>
+      <w:r>
+        <w:rPr>
+          <w:rFonts w:ascii="Arial" w:hAnsi="Arial" w:cs="Arial"/>
+          <w:b/>
+          <w:bCs/>
+        </w:rPr>
+        <w:t>Show</w:t>
+      </w:r>
+      <w:proofErr w:type="gramEnd"/>
+      <w:r>
+        <w:rPr>
+          <w:rFonts w:ascii="Arial" w:hAnsi="Arial" w:cs="Arial"/>
+          <w:b/>
+          <w:bCs/>
+        </w:rPr>
+        <w:t xml:space="preserve"> (</w:t>
       </w:r>
       <w:r>
         <w:rPr>
@@ -2267,7 +3123,25 @@
           <w:b/>
           <w:bCs/>
         </w:rPr>
-        <w:t xml:space="preserve">Scale (SizeF): </w:t>
+        <w:t>Scale (</w:t>
+      </w:r>
+      <w:proofErr w:type="spellStart"/>
+      <w:r>
+        <w:rPr>
+          <w:rFonts w:ascii="Arial" w:hAnsi="Arial" w:cs="Arial"/>
+          <w:b/>
+          <w:bCs/>
+        </w:rPr>
+        <w:t>SizeF</w:t>
+      </w:r>
+      <w:proofErr w:type="spellEnd"/>
+      <w:r>
+        <w:rPr>
+          <w:rFonts w:ascii="Arial" w:hAnsi="Arial" w:cs="Arial"/>
+          <w:b/>
+          <w:bCs/>
+        </w:rPr>
+        <w:t xml:space="preserve">): </w:t>
       </w:r>
       <w:r>
         <w:rPr>
@@ -2289,13 +3163,23 @@
           <w:bCs/>
         </w:rPr>
       </w:pPr>
-      <w:r>
-        <w:rPr>
-          <w:rFonts w:ascii="Arial" w:hAnsi="Arial" w:cs="Arial"/>
-          <w:b/>
-          <w:bCs/>
-        </w:rPr>
-        <w:t xml:space="preserve">GetChildAtPoint (Point): </w:t>
+      <w:proofErr w:type="spellStart"/>
+      <w:r>
+        <w:rPr>
+          <w:rFonts w:ascii="Arial" w:hAnsi="Arial" w:cs="Arial"/>
+          <w:b/>
+          <w:bCs/>
+        </w:rPr>
+        <w:t>GetChildAtPoint</w:t>
+      </w:r>
+      <w:proofErr w:type="spellEnd"/>
+      <w:r>
+        <w:rPr>
+          <w:rFonts w:ascii="Arial" w:hAnsi="Arial" w:cs="Arial"/>
+          <w:b/>
+          <w:bCs/>
+        </w:rPr>
+        <w:t xml:space="preserve"> (Point): </w:t>
       </w:r>
       <w:r>
         <w:rPr>
@@ -2317,13 +3201,23 @@
           <w:bCs/>
         </w:rPr>
       </w:pPr>
-      <w:r>
-        <w:rPr>
-          <w:rFonts w:ascii="Arial" w:hAnsi="Arial" w:cs="Arial"/>
-          <w:b/>
-          <w:bCs/>
-        </w:rPr>
-        <w:t xml:space="preserve">Dispose (): </w:t>
+      <w:proofErr w:type="spellStart"/>
+      <w:r>
+        <w:rPr>
+          <w:rFonts w:ascii="Arial" w:hAnsi="Arial" w:cs="Arial"/>
+          <w:b/>
+          <w:bCs/>
+        </w:rPr>
+        <w:t>Dispose</w:t>
+      </w:r>
+      <w:proofErr w:type="spellEnd"/>
+      <w:r>
+        <w:rPr>
+          <w:rFonts w:ascii="Arial" w:hAnsi="Arial" w:cs="Arial"/>
+          <w:b/>
+          <w:bCs/>
+        </w:rPr>
+        <w:t xml:space="preserve"> (): </w:t>
       </w:r>
       <w:r>
         <w:rPr>
@@ -2356,7 +3250,25 @@
           <w:bCs/>
         </w:rPr>
         <w:br/>
-        <w:t>12. Describa al menos 10 propiedades, 10 métodos y 10 eventos del control Combobox.</w:t>
+        <w:t xml:space="preserve">12. Describa al menos 10 propiedades, 10 métodos y 10 eventos del control </w:t>
+      </w:r>
+      <w:proofErr w:type="spellStart"/>
+      <w:r>
+        <w:rPr>
+          <w:rFonts w:ascii="Arial" w:hAnsi="Arial" w:cs="Arial"/>
+          <w:b/>
+          <w:bCs/>
+        </w:rPr>
+        <w:t>Combobox</w:t>
+      </w:r>
+      <w:proofErr w:type="spellEnd"/>
+      <w:r>
+        <w:rPr>
+          <w:rFonts w:ascii="Arial" w:hAnsi="Arial" w:cs="Arial"/>
+          <w:b/>
+          <w:bCs/>
+        </w:rPr>
+        <w:t>.</w:t>
       </w:r>
       <w:r>
         <w:rPr>
@@ -2365,7 +3277,25 @@
           <w:bCs/>
         </w:rPr>
         <w:br/>
-        <w:t>13. Describa al menos 10 propiedades, 10 métodos y 10 eventos del control DateTimePicker.</w:t>
+        <w:t xml:space="preserve">13. Describa al menos 10 propiedades, 10 métodos y 10 eventos del control </w:t>
+      </w:r>
+      <w:proofErr w:type="spellStart"/>
+      <w:r>
+        <w:rPr>
+          <w:rFonts w:ascii="Arial" w:hAnsi="Arial" w:cs="Arial"/>
+          <w:b/>
+          <w:bCs/>
+        </w:rPr>
+        <w:t>DateTimePicker</w:t>
+      </w:r>
+      <w:proofErr w:type="spellEnd"/>
+      <w:r>
+        <w:rPr>
+          <w:rFonts w:ascii="Arial" w:hAnsi="Arial" w:cs="Arial"/>
+          <w:b/>
+          <w:bCs/>
+        </w:rPr>
+        <w:t>.</w:t>
       </w:r>
       <w:r>
         <w:rPr>
@@ -2433,18 +3363,91 @@
     </w:p>
     <w:p>
       <w:pPr>
-        <w:rPr>
-          <w:rFonts w:ascii="Arial" w:hAnsi="Arial" w:cs="Arial"/>
-          <w:b/>
-          <w:bCs/>
-        </w:rPr>
-      </w:pPr>
-      <w:r>
-        <w:rPr>
-          <w:rFonts w:ascii="Arial" w:hAnsi="Arial" w:cs="Arial"/>
-          <w:b/>
-          <w:bCs/>
-        </w:rPr>
+        <w:pStyle w:val="Prrafodelista"/>
+        <w:numPr>
+          <w:ilvl w:val="0"/>
+          <w:numId w:val="4"/>
+        </w:numPr>
+        <w:rPr>
+          <w:rFonts w:ascii="Arial" w:hAnsi="Arial" w:cs="Arial"/>
+          <w:b/>
+          <w:bCs/>
+        </w:rPr>
+      </w:pPr>
+      <w:r>
+        <w:rPr>
+          <w:rFonts w:ascii="Arial" w:hAnsi="Arial" w:cs="Arial"/>
+        </w:rPr>
+        <w:t xml:space="preserve">La función devuelve un valor que puede usarse en una expresión (Por ejemplo, resultado= Sumar (2,3)). Mientras que un procedimiento solo ejecuta acciones. </w:t>
+      </w:r>
+    </w:p>
+    <w:p>
+      <w:pPr>
+        <w:pStyle w:val="Prrafodelista"/>
+        <w:rPr>
+          <w:rFonts w:ascii="Arial" w:hAnsi="Arial" w:cs="Arial"/>
+          <w:b/>
+          <w:bCs/>
+        </w:rPr>
+      </w:pPr>
+      <w:proofErr w:type="spellStart"/>
+      <w:r>
+        <w:rPr>
+          <w:rFonts w:ascii="Arial" w:hAnsi="Arial" w:cs="Arial"/>
+        </w:rPr>
+        <w:t>Ademas</w:t>
+      </w:r>
+      <w:proofErr w:type="spellEnd"/>
+      <w:r>
+        <w:rPr>
+          <w:rFonts w:ascii="Arial" w:hAnsi="Arial" w:cs="Arial"/>
+        </w:rPr>
+        <w:t xml:space="preserve"> el procedimiento se declara tipo </w:t>
+      </w:r>
+      <w:proofErr w:type="spellStart"/>
+      <w:r>
+        <w:rPr>
+          <w:rFonts w:ascii="Arial" w:hAnsi="Arial" w:cs="Arial"/>
+        </w:rPr>
+        <w:t>void</w:t>
+      </w:r>
+      <w:proofErr w:type="spellEnd"/>
+      <w:r>
+        <w:rPr>
+          <w:rFonts w:ascii="Arial" w:hAnsi="Arial" w:cs="Arial"/>
+        </w:rPr>
+        <w:t xml:space="preserve"> y la función se declara indicando el tipo de dato que devuelve y usa </w:t>
+      </w:r>
+      <w:proofErr w:type="spellStart"/>
+      <w:r>
+        <w:rPr>
+          <w:rFonts w:ascii="Arial" w:hAnsi="Arial" w:cs="Arial"/>
+        </w:rPr>
+        <w:t>return</w:t>
+      </w:r>
+      <w:proofErr w:type="spellEnd"/>
+      <w:r>
+        <w:rPr>
+          <w:rFonts w:ascii="Arial" w:hAnsi="Arial" w:cs="Arial"/>
+        </w:rPr>
+        <w:t xml:space="preserve">. </w:t>
+      </w:r>
+    </w:p>
+    <w:p>
+      <w:pPr>
+        <w:rPr>
+          <w:rFonts w:ascii="Arial" w:hAnsi="Arial" w:cs="Arial"/>
+          <w:b/>
+          <w:bCs/>
+        </w:rPr>
+      </w:pPr>
+      <w:r>
+        <w:rPr>
+          <w:rFonts w:ascii="Arial" w:hAnsi="Arial" w:cs="Arial"/>
+          <w:b/>
+          <w:bCs/>
+        </w:rPr>
+        <w:lastRenderedPageBreak/>
         <w:t>PROGRAMACIÓN Y ESTRUCTURAS DE DATOS / Pág.3</w:t>
       </w:r>
       <w:r>
@@ -2454,8 +3457,57 @@
           <w:bCs/>
         </w:rPr>
         <w:br/>
-        <w:t>19. ¿Qué significa que el parámetro de un procedimiento se pasa por valor?</w:t>
-      </w:r>
+        <w:t>19. ¿Qué significa que el parámetro de un procedimiento se pasa por</w:t>
+      </w:r>
+      <w:r>
+        <w:rPr>
+          <w:rFonts w:ascii="Arial" w:hAnsi="Arial" w:cs="Arial"/>
+          <w:b/>
+          <w:bCs/>
+        </w:rPr>
+        <w:t xml:space="preserve"> </w:t>
+      </w:r>
+      <w:r>
+        <w:rPr>
+          <w:rFonts w:ascii="Arial" w:hAnsi="Arial" w:cs="Arial"/>
+          <w:b/>
+          <w:bCs/>
+        </w:rPr>
+        <w:t>valor?</w:t>
+      </w:r>
+    </w:p>
+    <w:p>
+      <w:pPr>
+        <w:pStyle w:val="Prrafodelista"/>
+        <w:numPr>
+          <w:ilvl w:val="0"/>
+          <w:numId w:val="4"/>
+        </w:numPr>
+        <w:rPr>
+          <w:rFonts w:ascii="Arial" w:hAnsi="Arial" w:cs="Arial"/>
+        </w:rPr>
+      </w:pPr>
+      <w:r>
+        <w:rPr>
+          <w:rFonts w:ascii="Arial" w:hAnsi="Arial" w:cs="Arial"/>
+        </w:rPr>
+        <w:t>Cuando un procedimiento se pasa por valor s</w:t>
+      </w:r>
+      <w:r>
+        <w:rPr>
+          <w:rFonts w:ascii="Arial" w:hAnsi="Arial" w:cs="Arial"/>
+        </w:rPr>
+        <w:t>ignifica que el método recibe una copia del dato, los cambios dentro del método no afectan a la variable original de quien lo llamo.</w:t>
+      </w:r>
+    </w:p>
+    <w:p>
+      <w:pPr>
+        <w:rPr>
+          <w:rFonts w:ascii="Arial" w:hAnsi="Arial" w:cs="Arial"/>
+          <w:b/>
+          <w:bCs/>
+        </w:rPr>
+      </w:pPr>
       <w:r>
         <w:rPr>
           <w:rFonts w:ascii="Arial" w:hAnsi="Arial" w:cs="Arial"/>
@@ -2465,6 +3517,39 @@
         <w:br/>
         <w:t>20. ¿Qué significa que el parámetro de una función se pasa por referencia?</w:t>
       </w:r>
+    </w:p>
+    <w:p>
+      <w:pPr>
+        <w:pStyle w:val="Prrafodelista"/>
+        <w:numPr>
+          <w:ilvl w:val="0"/>
+          <w:numId w:val="4"/>
+        </w:numPr>
+        <w:rPr>
+          <w:rFonts w:ascii="Arial" w:hAnsi="Arial" w:cs="Arial"/>
+        </w:rPr>
+      </w:pPr>
+      <w:r>
+        <w:rPr>
+          <w:rFonts w:ascii="Arial" w:hAnsi="Arial" w:cs="Arial"/>
+        </w:rPr>
+        <w:t>Cuando el parámetro de una función se pasa por referencia significa que e</w:t>
+      </w:r>
+      <w:r>
+        <w:rPr>
+          <w:rFonts w:ascii="Arial" w:hAnsi="Arial" w:cs="Arial"/>
+        </w:rPr>
+        <w:t>l método recibe una referencia al mismo dato en memoria; los cambios SI se reflejan en la variable original.</w:t>
+      </w:r>
+    </w:p>
+    <w:p>
+      <w:pPr>
+        <w:rPr>
+          <w:rFonts w:ascii="Arial" w:hAnsi="Arial" w:cs="Arial"/>
+          <w:b/>
+          <w:bCs/>
+        </w:rPr>
+      </w:pPr>
       <w:r>
         <w:rPr>
           <w:rFonts w:ascii="Arial" w:hAnsi="Arial" w:cs="Arial"/>
@@ -2489,17 +3574,83 @@
           <w:b/>
           <w:bCs/>
         </w:rPr>
-        <w:br/>
-      </w:r>
-      <w:r>
-        <w:rPr>
-          <w:rFonts w:ascii="Arial" w:hAnsi="Arial" w:cs="Arial"/>
-          <w:b/>
-          <w:bCs/>
-        </w:rPr>
-        <w:lastRenderedPageBreak/>
+        <w:t xml:space="preserve"> </w:t>
+      </w:r>
+      <w:r>
+        <w:rPr>
+          <w:rFonts w:ascii="Arial" w:hAnsi="Arial" w:cs="Arial"/>
+          <w:b/>
+          <w:bCs/>
+        </w:rPr>
         <w:t>diferencian.</w:t>
       </w:r>
+    </w:p>
+    <w:p>
+      <w:pPr>
+        <w:pStyle w:val="Prrafodelista"/>
+        <w:numPr>
+          <w:ilvl w:val="0"/>
+          <w:numId w:val="4"/>
+        </w:numPr>
+        <w:rPr>
+          <w:rFonts w:ascii="Arial" w:hAnsi="Arial" w:cs="Arial"/>
+          <w:b/>
+          <w:bCs/>
+        </w:rPr>
+      </w:pPr>
+      <w:r>
+        <w:rPr>
+          <w:rFonts w:ascii="Arial" w:hAnsi="Arial" w:cs="Arial"/>
+          <w:b/>
+          <w:bCs/>
+        </w:rPr>
+        <w:t>If – Else If- Else</w:t>
+      </w:r>
+      <w:r>
+        <w:rPr>
+          <w:rFonts w:ascii="Arial" w:hAnsi="Arial" w:cs="Arial"/>
+        </w:rPr>
+        <w:t>: Esta estructura de decisión evalúa una condición y ejecuta un bloque u otro dependiendo de si se cumple o no</w:t>
+      </w:r>
+      <w:r>
+        <w:rPr>
+          <w:rFonts w:ascii="Arial" w:hAnsi="Arial" w:cs="Arial"/>
+        </w:rPr>
+        <w:t>. Con el Else If, abre más condiciones y otro bloque de posibles ejecuciones. Para decisiones binarias y validaciones puntuales.</w:t>
+      </w:r>
+    </w:p>
+    <w:p>
+      <w:pPr>
+        <w:pStyle w:val="Prrafodelista"/>
+        <w:rPr>
+          <w:rFonts w:ascii="Arial" w:hAnsi="Arial" w:cs="Arial"/>
+          <w:b/>
+          <w:bCs/>
+        </w:rPr>
+      </w:pPr>
+      <w:r>
+        <w:rPr>
+          <w:rFonts w:ascii="Arial" w:hAnsi="Arial" w:cs="Arial"/>
+          <w:b/>
+          <w:bCs/>
+        </w:rPr>
+        <w:t>Switch</w:t>
+      </w:r>
+      <w:r>
+        <w:rPr>
+          <w:rFonts w:ascii="Arial" w:hAnsi="Arial" w:cs="Arial"/>
+        </w:rPr>
+        <w:t xml:space="preserve">: Evalúa una variable contra múltiples valores posibles y ejecuta el bloque que coincida con el valor evaluado. Es más claro que IF si se comparan varios valores discretos de una misma variable. Es como un menú de opciones. </w:t>
+      </w:r>
+    </w:p>
+    <w:p>
+      <w:pPr>
+        <w:rPr>
+          <w:rFonts w:ascii="Arial" w:hAnsi="Arial" w:cs="Arial"/>
+          <w:b/>
+          <w:bCs/>
+        </w:rPr>
+      </w:pPr>
       <w:r>
         <w:rPr>
           <w:rFonts w:ascii="Arial" w:hAnsi="Arial" w:cs="Arial"/>
@@ -2515,9 +3666,152 @@
           <w:b/>
           <w:bCs/>
         </w:rPr>
-        <w:br/>
+        <w:t xml:space="preserve"> </w:t>
+      </w:r>
+      <w:r>
+        <w:rPr>
+          <w:rFonts w:ascii="Arial" w:hAnsi="Arial" w:cs="Arial"/>
+          <w:b/>
+          <w:bCs/>
+        </w:rPr>
         <w:t>diferencian.</w:t>
       </w:r>
+    </w:p>
+    <w:p>
+      <w:pPr>
+        <w:pStyle w:val="Prrafodelista"/>
+        <w:numPr>
+          <w:ilvl w:val="0"/>
+          <w:numId w:val="4"/>
+        </w:numPr>
+        <w:rPr>
+          <w:rFonts w:ascii="Arial" w:hAnsi="Arial" w:cs="Arial"/>
+          <w:b/>
+          <w:bCs/>
+        </w:rPr>
+      </w:pPr>
+      <w:r>
+        <w:rPr>
+          <w:rFonts w:ascii="Arial" w:hAnsi="Arial" w:cs="Arial"/>
+          <w:b/>
+          <w:bCs/>
+        </w:rPr>
+        <w:t xml:space="preserve">For: </w:t>
+      </w:r>
+      <w:r>
+        <w:rPr>
+          <w:rFonts w:ascii="Arial" w:hAnsi="Arial" w:cs="Arial"/>
+        </w:rPr>
+        <w:t xml:space="preserve">Se utiliza cuando sabemos con exactitud cuantas veces debe repetirse un bloque de código. Utiliza una variable contadora que se incrementa o decrementa hasta alcanzar un valor límite. </w:t>
+      </w:r>
+      <w:r>
+        <w:rPr>
+          <w:rFonts w:ascii="Arial" w:hAnsi="Arial" w:cs="Arial"/>
+        </w:rPr>
+        <w:t xml:space="preserve">Tiene un límite de ejecuciones del bloque de código. </w:t>
+      </w:r>
+    </w:p>
+    <w:p>
+      <w:pPr>
+        <w:pStyle w:val="Prrafodelista"/>
+        <w:numPr>
+          <w:ilvl w:val="0"/>
+          <w:numId w:val="4"/>
+        </w:numPr>
+        <w:rPr>
+          <w:rFonts w:ascii="Arial" w:hAnsi="Arial" w:cs="Arial"/>
+          <w:b/>
+          <w:bCs/>
+        </w:rPr>
+      </w:pPr>
+      <w:r>
+        <w:rPr>
+          <w:rFonts w:ascii="Arial" w:hAnsi="Arial" w:cs="Arial"/>
+          <w:b/>
+          <w:bCs/>
+        </w:rPr>
+        <w:t xml:space="preserve">While: </w:t>
+      </w:r>
+      <w:r>
+        <w:rPr>
+          <w:rFonts w:ascii="Arial" w:hAnsi="Arial" w:cs="Arial"/>
+        </w:rPr>
+        <w:t>Evalúa la condición antes de cada iteración. Si la condición es verdadera ejecuta el bloque</w:t>
+      </w:r>
+      <w:r>
+        <w:rPr>
+          <w:rFonts w:ascii="Arial" w:hAnsi="Arial" w:cs="Arial"/>
+        </w:rPr>
+        <w:t xml:space="preserve"> de código y vuelve a evaluar. En caso de ser falsa, no se ejecuta. No tiene </w:t>
+      </w:r>
+      <w:proofErr w:type="gramStart"/>
+      <w:r>
+        <w:rPr>
+          <w:rFonts w:ascii="Arial" w:hAnsi="Arial" w:cs="Arial"/>
+        </w:rPr>
+        <w:t>límite</w:t>
+      </w:r>
+      <w:proofErr w:type="gramEnd"/>
+      <w:r>
+        <w:rPr>
+          <w:rFonts w:ascii="Arial" w:hAnsi="Arial" w:cs="Arial"/>
+        </w:rPr>
+        <w:t xml:space="preserve"> pero como evalúa de antemano, puede que no se ejecute nunca. </w:t>
+      </w:r>
+    </w:p>
+    <w:p>
+      <w:pPr>
+        <w:pStyle w:val="Prrafodelista"/>
+        <w:numPr>
+          <w:ilvl w:val="0"/>
+          <w:numId w:val="4"/>
+        </w:numPr>
+        <w:rPr>
+          <w:rFonts w:ascii="Arial" w:hAnsi="Arial" w:cs="Arial"/>
+          <w:b/>
+          <w:bCs/>
+        </w:rPr>
+      </w:pPr>
+      <w:r>
+        <w:rPr>
+          <w:rFonts w:ascii="Arial" w:hAnsi="Arial" w:cs="Arial"/>
+          <w:b/>
+          <w:bCs/>
+        </w:rPr>
+        <w:t xml:space="preserve">Do-While: </w:t>
+      </w:r>
+      <w:r>
+        <w:rPr>
+          <w:rFonts w:ascii="Arial" w:hAnsi="Arial" w:cs="Arial"/>
+        </w:rPr>
+        <w:t>Es inverso al While, primero ejecuta el código y luego analiza la condición por primera vez. En caso de ser verdadera continúa ejecutando el bloque de código hasta que la condición sea falsa. Se ejecuta mínimo una vez el bloque de código.</w:t>
+      </w:r>
+      <w:r>
+        <w:rPr>
+          <w:rFonts w:ascii="Arial" w:hAnsi="Arial" w:cs="Arial"/>
+          <w:b/>
+          <w:bCs/>
+        </w:rPr>
+        <w:t xml:space="preserve"> </w:t>
+      </w:r>
+    </w:p>
+    <w:p>
+      <w:pPr>
+        <w:rPr>
+          <w:rFonts w:ascii="Arial" w:hAnsi="Arial" w:cs="Arial"/>
+          <w:b/>
+          <w:bCs/>
+        </w:rPr>
+      </w:pPr>
+    </w:p>
+    <w:p>
+      <w:pPr>
+        <w:rPr>
+          <w:rFonts w:ascii="Arial" w:hAnsi="Arial" w:cs="Arial"/>
+          <w:b/>
+          <w:bCs/>
+        </w:rPr>
+      </w:pPr>
       <w:r>
         <w:rPr>
           <w:rFonts w:ascii="Arial" w:hAnsi="Arial" w:cs="Arial"/>
@@ -2527,6 +3821,183 @@
         <w:br/>
         <w:t>23. ¿Cómo se crea una estructura en el entorno visto en clase?</w:t>
       </w:r>
+    </w:p>
+    <w:p>
+      <w:pPr>
+        <w:pStyle w:val="Prrafodelista"/>
+        <w:numPr>
+          <w:ilvl w:val="0"/>
+          <w:numId w:val="11"/>
+        </w:numPr>
+        <w:rPr>
+          <w:rFonts w:ascii="Arial" w:hAnsi="Arial" w:cs="Arial"/>
+        </w:rPr>
+      </w:pPr>
+      <w:r>
+        <w:rPr>
+          <w:rFonts w:ascii="Arial" w:hAnsi="Arial" w:cs="Arial"/>
+        </w:rPr>
+        <w:t xml:space="preserve">Primero se declara con la variable </w:t>
+      </w:r>
+      <w:proofErr w:type="spellStart"/>
+      <w:r>
+        <w:rPr>
+          <w:rFonts w:ascii="Arial" w:hAnsi="Arial" w:cs="Arial"/>
+        </w:rPr>
+        <w:t>Struct</w:t>
+      </w:r>
+      <w:proofErr w:type="spellEnd"/>
+      <w:r>
+        <w:rPr>
+          <w:rFonts w:ascii="Arial" w:hAnsi="Arial" w:cs="Arial"/>
+        </w:rPr>
+        <w:t xml:space="preserve"> y agrupa varios campos en un mismo valor. Ejemplo: </w:t>
+      </w:r>
+      <w:proofErr w:type="spellStart"/>
+      <w:r>
+        <w:rPr>
+          <w:rFonts w:ascii="Arial" w:hAnsi="Arial" w:cs="Arial"/>
+          <w:i/>
+          <w:iCs/>
+        </w:rPr>
+        <w:t>Struct</w:t>
+      </w:r>
+      <w:proofErr w:type="spellEnd"/>
+      <w:r>
+        <w:rPr>
+          <w:rFonts w:ascii="Arial" w:hAnsi="Arial" w:cs="Arial"/>
+          <w:i/>
+          <w:iCs/>
+        </w:rPr>
+        <w:t xml:space="preserve"> Punto </w:t>
+      </w:r>
+      <w:proofErr w:type="gramStart"/>
+      <w:r>
+        <w:rPr>
+          <w:rFonts w:ascii="Arial" w:hAnsi="Arial" w:cs="Arial"/>
+          <w:i/>
+          <w:iCs/>
+        </w:rPr>
+        <w:t xml:space="preserve">{ </w:t>
+      </w:r>
+      <w:proofErr w:type="spellStart"/>
+      <w:r>
+        <w:rPr>
+          <w:rFonts w:ascii="Arial" w:hAnsi="Arial" w:cs="Arial"/>
+          <w:i/>
+          <w:iCs/>
+        </w:rPr>
+        <w:t>public</w:t>
+      </w:r>
+      <w:proofErr w:type="spellEnd"/>
+      <w:proofErr w:type="gramEnd"/>
+      <w:r>
+        <w:rPr>
+          <w:rFonts w:ascii="Arial" w:hAnsi="Arial" w:cs="Arial"/>
+          <w:i/>
+          <w:iCs/>
+        </w:rPr>
+        <w:t xml:space="preserve"> </w:t>
+      </w:r>
+      <w:proofErr w:type="spellStart"/>
+      <w:r>
+        <w:rPr>
+          <w:rFonts w:ascii="Arial" w:hAnsi="Arial" w:cs="Arial"/>
+          <w:i/>
+          <w:iCs/>
+        </w:rPr>
+        <w:t>int</w:t>
+      </w:r>
+      <w:proofErr w:type="spellEnd"/>
+      <w:r>
+        <w:rPr>
+          <w:rFonts w:ascii="Arial" w:hAnsi="Arial" w:cs="Arial"/>
+          <w:i/>
+          <w:iCs/>
+        </w:rPr>
+        <w:t xml:space="preserve"> </w:t>
+      </w:r>
+      <w:proofErr w:type="gramStart"/>
+      <w:r>
+        <w:rPr>
+          <w:rFonts w:ascii="Arial" w:hAnsi="Arial" w:cs="Arial"/>
+          <w:i/>
+          <w:iCs/>
+        </w:rPr>
+        <w:t>X ;</w:t>
+      </w:r>
+      <w:proofErr w:type="gramEnd"/>
+      <w:r>
+        <w:rPr>
+          <w:rFonts w:ascii="Arial" w:hAnsi="Arial" w:cs="Arial"/>
+          <w:i/>
+          <w:iCs/>
+        </w:rPr>
+        <w:t xml:space="preserve"> </w:t>
+      </w:r>
+      <w:proofErr w:type="spellStart"/>
+      <w:r>
+        <w:rPr>
+          <w:rFonts w:ascii="Arial" w:hAnsi="Arial" w:cs="Arial"/>
+          <w:i/>
+          <w:iCs/>
+        </w:rPr>
+        <w:t>public</w:t>
+      </w:r>
+      <w:proofErr w:type="spellEnd"/>
+      <w:r>
+        <w:rPr>
+          <w:rFonts w:ascii="Arial" w:hAnsi="Arial" w:cs="Arial"/>
+          <w:i/>
+          <w:iCs/>
+        </w:rPr>
+        <w:t xml:space="preserve"> </w:t>
+      </w:r>
+      <w:proofErr w:type="spellStart"/>
+      <w:r>
+        <w:rPr>
+          <w:rFonts w:ascii="Arial" w:hAnsi="Arial" w:cs="Arial"/>
+          <w:i/>
+          <w:iCs/>
+        </w:rPr>
+        <w:t>int</w:t>
+      </w:r>
+      <w:proofErr w:type="spellEnd"/>
+      <w:r>
+        <w:rPr>
+          <w:rFonts w:ascii="Arial" w:hAnsi="Arial" w:cs="Arial"/>
+          <w:i/>
+          <w:iCs/>
+        </w:rPr>
+        <w:t xml:space="preserve"> Y</w:t>
+      </w:r>
+      <w:proofErr w:type="gramStart"/>
+      <w:r>
+        <w:rPr>
+          <w:rFonts w:ascii="Arial" w:hAnsi="Arial" w:cs="Arial"/>
+          <w:i/>
+          <w:iCs/>
+        </w:rPr>
+        <w:t>; }</w:t>
+      </w:r>
+      <w:proofErr w:type="gramEnd"/>
+      <w:r>
+        <w:rPr>
+          <w:rFonts w:ascii="Arial" w:hAnsi="Arial" w:cs="Arial"/>
+          <w:i/>
+          <w:iCs/>
+        </w:rPr>
+        <w:t>.</w:t>
+      </w:r>
+    </w:p>
+    <w:p>
+      <w:pPr>
+        <w:rPr>
+          <w:rFonts w:ascii="Arial" w:hAnsi="Arial" w:cs="Arial"/>
+          <w:b/>
+          <w:bCs/>
+        </w:rPr>
+      </w:pPr>
       <w:r>
         <w:rPr>
           <w:rFonts w:ascii="Arial" w:hAnsi="Arial" w:cs="Arial"/>
@@ -2561,7 +4032,25 @@
           <w:bCs/>
         </w:rPr>
         <w:br/>
-        <w:t>27. ¿Cuál es el uso ideal de una variable de tipo Boolean?</w:t>
+        <w:t xml:space="preserve">27. ¿Cuál es el uso ideal de una variable de tipo </w:t>
+      </w:r>
+      <w:proofErr w:type="spellStart"/>
+      <w:r>
+        <w:rPr>
+          <w:rFonts w:ascii="Arial" w:hAnsi="Arial" w:cs="Arial"/>
+          <w:b/>
+          <w:bCs/>
+        </w:rPr>
+        <w:t>Boolean</w:t>
+      </w:r>
+      <w:proofErr w:type="spellEnd"/>
+      <w:r>
+        <w:rPr>
+          <w:rFonts w:ascii="Arial" w:hAnsi="Arial" w:cs="Arial"/>
+          <w:b/>
+          <w:bCs/>
+        </w:rPr>
+        <w:t>?</w:t>
       </w:r>
       <w:r>
         <w:rPr>
@@ -2570,7 +4059,61 @@
           <w:bCs/>
         </w:rPr>
         <w:br/>
-        <w:t>28. ¿Para que se usa el método Parse cuando se lo utiliza por ejemplo como Decimal.Parse?</w:t>
+        <w:t xml:space="preserve">28. </w:t>
+      </w:r>
+      <w:proofErr w:type="gramStart"/>
+      <w:r>
+        <w:rPr>
+          <w:rFonts w:ascii="Arial" w:hAnsi="Arial" w:cs="Arial"/>
+          <w:b/>
+          <w:bCs/>
+        </w:rPr>
+        <w:t xml:space="preserve">¿Para </w:t>
+      </w:r>
+      <w:proofErr w:type="spellStart"/>
+      <w:r>
+        <w:rPr>
+          <w:rFonts w:ascii="Arial" w:hAnsi="Arial" w:cs="Arial"/>
+          <w:b/>
+          <w:bCs/>
+        </w:rPr>
+        <w:t>que</w:t>
+      </w:r>
+      <w:proofErr w:type="spellEnd"/>
+      <w:r>
+        <w:rPr>
+          <w:rFonts w:ascii="Arial" w:hAnsi="Arial" w:cs="Arial"/>
+          <w:b/>
+          <w:bCs/>
+        </w:rPr>
+        <w:t xml:space="preserve"> se usa el método Parse cuando se lo utiliza por ejemplo como </w:t>
+      </w:r>
+      <w:proofErr w:type="spellStart"/>
+      <w:r>
+        <w:rPr>
+          <w:rFonts w:ascii="Arial" w:hAnsi="Arial" w:cs="Arial"/>
+          <w:b/>
+          <w:bCs/>
+        </w:rPr>
+        <w:t>Decimal.</w:t>
+      </w:r>
+      <w:proofErr w:type="gramEnd"/>
+      <w:r>
+        <w:rPr>
+          <w:rFonts w:ascii="Arial" w:hAnsi="Arial" w:cs="Arial"/>
+          <w:b/>
+          <w:bCs/>
+        </w:rPr>
+        <w:t>Parse</w:t>
+      </w:r>
+      <w:proofErr w:type="spellEnd"/>
+      <w:r>
+        <w:rPr>
+          <w:rFonts w:ascii="Arial" w:hAnsi="Arial" w:cs="Arial"/>
+          <w:b/>
+          <w:bCs/>
+        </w:rPr>
+        <w:t>?</w:t>
       </w:r>
       <w:r>
         <w:rPr>
@@ -2588,7 +4131,43 @@
           <w:bCs/>
         </w:rPr>
         <w:br/>
-        <w:t>30. ¿Cuándo hablamos de boxing y unboxing a que nos referimos?</w:t>
+        <w:t xml:space="preserve">30. ¿Cuándo hablamos de </w:t>
+      </w:r>
+      <w:proofErr w:type="spellStart"/>
+      <w:r>
+        <w:rPr>
+          <w:rFonts w:ascii="Arial" w:hAnsi="Arial" w:cs="Arial"/>
+          <w:b/>
+          <w:bCs/>
+        </w:rPr>
+        <w:t>boxing</w:t>
+      </w:r>
+      <w:proofErr w:type="spellEnd"/>
+      <w:r>
+        <w:rPr>
+          <w:rFonts w:ascii="Arial" w:hAnsi="Arial" w:cs="Arial"/>
+          <w:b/>
+          <w:bCs/>
+        </w:rPr>
+        <w:t xml:space="preserve"> y </w:t>
+      </w:r>
+      <w:proofErr w:type="spellStart"/>
+      <w:r>
+        <w:rPr>
+          <w:rFonts w:ascii="Arial" w:hAnsi="Arial" w:cs="Arial"/>
+          <w:b/>
+          <w:bCs/>
+        </w:rPr>
+        <w:t>unboxing</w:t>
+      </w:r>
+      <w:proofErr w:type="spellEnd"/>
+      <w:r>
+        <w:rPr>
+          <w:rFonts w:ascii="Arial" w:hAnsi="Arial" w:cs="Arial"/>
+          <w:b/>
+          <w:bCs/>
+        </w:rPr>
+        <w:t xml:space="preserve"> a que nos referimos?</w:t>
       </w:r>
     </w:p>
     <w:p/>
@@ -2696,7 +4275,7 @@
   <w:abstractNum w:abstractNumId="1" w15:restartNumberingAfterBreak="0">
     <w:nsid w:val="25FD1F29"/>
     <w:multiLevelType w:val="hybridMultilevel"/>
-    <w:tmpl w:val="34C6E1B0"/>
+    <w:tmpl w:val="B4046E70"/>
     <w:lvl w:ilvl="0" w:tplc="2C0A000F">
       <w:start w:val="1"/>
       <w:numFmt w:val="decimal"/>
@@ -3246,9 +4825,95 @@
     </w:lvl>
   </w:abstractNum>
   <w:abstractNum w:abstractNumId="7" w15:restartNumberingAfterBreak="0">
-    <w:nsid w:val="5B824B46"/>
+    <w:nsid w:val="55863D01"/>
     <w:multiLevelType w:val="hybridMultilevel"/>
-    <w:tmpl w:val="C6787C24"/>
+    <w:tmpl w:val="1BA885A4"/>
+    <w:lvl w:ilvl="0" w:tplc="2C0A000F">
+      <w:start w:val="1"/>
+      <w:numFmt w:val="decimal"/>
+      <w:lvlText w:val="%1."/>
+      <w:lvlJc w:val="left"/>
+      <w:pPr>
+        <w:ind w:left="1440" w:hanging="360"/>
+      </w:pPr>
+    </w:lvl>
+    <w:lvl w:ilvl="1" w:tplc="2C0A0019" w:tentative="1">
+      <w:start w:val="1"/>
+      <w:numFmt w:val="lowerLetter"/>
+      <w:lvlText w:val="%2."/>
+      <w:lvlJc w:val="left"/>
+      <w:pPr>
+        <w:ind w:left="2160" w:hanging="360"/>
+      </w:pPr>
+    </w:lvl>
+    <w:lvl w:ilvl="2" w:tplc="2C0A001B" w:tentative="1">
+      <w:start w:val="1"/>
+      <w:numFmt w:val="lowerRoman"/>
+      <w:lvlText w:val="%3."/>
+      <w:lvlJc w:val="right"/>
+      <w:pPr>
+        <w:ind w:left="2880" w:hanging="180"/>
+      </w:pPr>
+    </w:lvl>
+    <w:lvl w:ilvl="3" w:tplc="2C0A000F" w:tentative="1">
+      <w:start w:val="1"/>
+      <w:numFmt w:val="decimal"/>
+      <w:lvlText w:val="%4."/>
+      <w:lvlJc w:val="left"/>
+      <w:pPr>
+        <w:ind w:left="3600" w:hanging="360"/>
+      </w:pPr>
+    </w:lvl>
+    <w:lvl w:ilvl="4" w:tplc="2C0A0019" w:tentative="1">
+      <w:start w:val="1"/>
+      <w:numFmt w:val="lowerLetter"/>
+      <w:lvlText w:val="%5."/>
+      <w:lvlJc w:val="left"/>
+      <w:pPr>
+        <w:ind w:left="4320" w:hanging="360"/>
+      </w:pPr>
+    </w:lvl>
+    <w:lvl w:ilvl="5" w:tplc="2C0A001B" w:tentative="1">
+      <w:start w:val="1"/>
+      <w:numFmt w:val="lowerRoman"/>
+      <w:lvlText w:val="%6."/>
+      <w:lvlJc w:val="right"/>
+      <w:pPr>
+        <w:ind w:left="5040" w:hanging="180"/>
+      </w:pPr>
+    </w:lvl>
+    <w:lvl w:ilvl="6" w:tplc="2C0A000F" w:tentative="1">
+      <w:start w:val="1"/>
+      <w:numFmt w:val="decimal"/>
+      <w:lvlText w:val="%7."/>
+      <w:lvlJc w:val="left"/>
+      <w:pPr>
+        <w:ind w:left="5760" w:hanging="360"/>
+      </w:pPr>
+    </w:lvl>
+    <w:lvl w:ilvl="7" w:tplc="2C0A0019" w:tentative="1">
+      <w:start w:val="1"/>
+      <w:numFmt w:val="lowerLetter"/>
+      <w:lvlText w:val="%8."/>
+      <w:lvlJc w:val="left"/>
+      <w:pPr>
+        <w:ind w:left="6480" w:hanging="360"/>
+      </w:pPr>
+    </w:lvl>
+    <w:lvl w:ilvl="8" w:tplc="2C0A001B" w:tentative="1">
+      <w:start w:val="1"/>
+      <w:numFmt w:val="lowerRoman"/>
+      <w:lvlText w:val="%9."/>
+      <w:lvlJc w:val="right"/>
+      <w:pPr>
+        <w:ind w:left="7200" w:hanging="180"/>
+      </w:pPr>
+    </w:lvl>
+  </w:abstractNum>
+  <w:abstractNum w:abstractNumId="8" w15:restartNumberingAfterBreak="0">
+    <w:nsid w:val="56C64119"/>
+    <w:multiLevelType w:val="hybridMultilevel"/>
+    <w:tmpl w:val="5404B3E8"/>
     <w:lvl w:ilvl="0" w:tplc="2C0A0001">
       <w:start w:val="1"/>
       <w:numFmt w:val="bullet"/>
@@ -3358,7 +5023,120 @@
       </w:rPr>
     </w:lvl>
   </w:abstractNum>
-  <w:abstractNum w:abstractNumId="8" w15:restartNumberingAfterBreak="0">
+  <w:abstractNum w:abstractNumId="9" w15:restartNumberingAfterBreak="0">
+    <w:nsid w:val="5B824B46"/>
+    <w:multiLevelType w:val="hybridMultilevel"/>
+    <w:tmpl w:val="3A369CD8"/>
+    <w:lvl w:ilvl="0" w:tplc="2C0A0001">
+      <w:start w:val="1"/>
+      <w:numFmt w:val="bullet"/>
+      <w:lvlText w:val=""/>
+      <w:lvlJc w:val="left"/>
+      <w:pPr>
+        <w:ind w:left="720" w:hanging="360"/>
+      </w:pPr>
+      <w:rPr>
+        <w:rFonts w:ascii="Symbol" w:hAnsi="Symbol" w:hint="default"/>
+      </w:rPr>
+    </w:lvl>
+    <w:lvl w:ilvl="1" w:tplc="2C0A0003" w:tentative="1">
+      <w:start w:val="1"/>
+      <w:numFmt w:val="bullet"/>
+      <w:lvlText w:val="o"/>
+      <w:lvlJc w:val="left"/>
+      <w:pPr>
+        <w:ind w:left="1440" w:hanging="360"/>
+      </w:pPr>
+      <w:rPr>
+        <w:rFonts w:ascii="Courier New" w:hAnsi="Courier New" w:cs="Courier New" w:hint="default"/>
+      </w:rPr>
+    </w:lvl>
+    <w:lvl w:ilvl="2" w:tplc="2C0A0005" w:tentative="1">
+      <w:start w:val="1"/>
+      <w:numFmt w:val="bullet"/>
+      <w:lvlText w:val=""/>
+      <w:lvlJc w:val="left"/>
+      <w:pPr>
+        <w:ind w:left="2160" w:hanging="360"/>
+      </w:pPr>
+      <w:rPr>
+        <w:rFonts w:ascii="Wingdings" w:hAnsi="Wingdings" w:hint="default"/>
+      </w:rPr>
+    </w:lvl>
+    <w:lvl w:ilvl="3" w:tplc="2C0A0001" w:tentative="1">
+      <w:start w:val="1"/>
+      <w:numFmt w:val="bullet"/>
+      <w:lvlText w:val=""/>
+      <w:lvlJc w:val="left"/>
+      <w:pPr>
+        <w:ind w:left="2880" w:hanging="360"/>
+      </w:pPr>
+      <w:rPr>
+        <w:rFonts w:ascii="Symbol" w:hAnsi="Symbol" w:hint="default"/>
+      </w:rPr>
+    </w:lvl>
+    <w:lvl w:ilvl="4" w:tplc="2C0A0003" w:tentative="1">
+      <w:start w:val="1"/>
+      <w:numFmt w:val="bullet"/>
+      <w:lvlText w:val="o"/>
+      <w:lvlJc w:val="left"/>
+      <w:pPr>
+        <w:ind w:left="3600" w:hanging="360"/>
+      </w:pPr>
+      <w:rPr>
+        <w:rFonts w:ascii="Courier New" w:hAnsi="Courier New" w:cs="Courier New" w:hint="default"/>
+      </w:rPr>
+    </w:lvl>
+    <w:lvl w:ilvl="5" w:tplc="2C0A0005" w:tentative="1">
+      <w:start w:val="1"/>
+      <w:numFmt w:val="bullet"/>
+      <w:lvlText w:val=""/>
+      <w:lvlJc w:val="left"/>
+      <w:pPr>
+        <w:ind w:left="4320" w:hanging="360"/>
+      </w:pPr>
+      <w:rPr>
+        <w:rFonts w:ascii="Wingdings" w:hAnsi="Wingdings" w:hint="default"/>
+      </w:rPr>
+    </w:lvl>
+    <w:lvl w:ilvl="6" w:tplc="2C0A0001" w:tentative="1">
+      <w:start w:val="1"/>
+      <w:numFmt w:val="bullet"/>
+      <w:lvlText w:val=""/>
+      <w:lvlJc w:val="left"/>
+      <w:pPr>
+        <w:ind w:left="5040" w:hanging="360"/>
+      </w:pPr>
+      <w:rPr>
+        <w:rFonts w:ascii="Symbol" w:hAnsi="Symbol" w:hint="default"/>
+      </w:rPr>
+    </w:lvl>
+    <w:lvl w:ilvl="7" w:tplc="2C0A0003" w:tentative="1">
+      <w:start w:val="1"/>
+      <w:numFmt w:val="bullet"/>
+      <w:lvlText w:val="o"/>
+      <w:lvlJc w:val="left"/>
+      <w:pPr>
+        <w:ind w:left="5760" w:hanging="360"/>
+      </w:pPr>
+      <w:rPr>
+        <w:rFonts w:ascii="Courier New" w:hAnsi="Courier New" w:cs="Courier New" w:hint="default"/>
+      </w:rPr>
+    </w:lvl>
+    <w:lvl w:ilvl="8" w:tplc="2C0A0005" w:tentative="1">
+      <w:start w:val="1"/>
+      <w:numFmt w:val="bullet"/>
+      <w:lvlText w:val=""/>
+      <w:lvlJc w:val="left"/>
+      <w:pPr>
+        <w:ind w:left="6480" w:hanging="360"/>
+      </w:pPr>
+      <w:rPr>
+        <w:rFonts w:ascii="Wingdings" w:hAnsi="Wingdings" w:hint="default"/>
+      </w:rPr>
+    </w:lvl>
+  </w:abstractNum>
+  <w:abstractNum w:abstractNumId="10" w15:restartNumberingAfterBreak="0">
     <w:nsid w:val="698D054C"/>
     <w:multiLevelType w:val="hybridMultilevel"/>
     <w:tmpl w:val="B7EA3D02"/>
@@ -3448,7 +5226,7 @@
     </w:lvl>
   </w:abstractNum>
   <w:num w:numId="1" w16cid:durableId="600795895">
-    <w:abstractNumId w:val="8"/>
+    <w:abstractNumId w:val="10"/>
   </w:num>
   <w:num w:numId="2" w16cid:durableId="739332369">
     <w:abstractNumId w:val="4"/>
@@ -3457,7 +5235,7 @@
     <w:abstractNumId w:val="0"/>
   </w:num>
   <w:num w:numId="4" w16cid:durableId="490607245">
-    <w:abstractNumId w:val="7"/>
+    <w:abstractNumId w:val="9"/>
   </w:num>
   <w:num w:numId="5" w16cid:durableId="1558711134">
     <w:abstractNumId w:val="5"/>
@@ -3473,6 +5251,12 @@
   </w:num>
   <w:num w:numId="9" w16cid:durableId="1101684002">
     <w:abstractNumId w:val="6"/>
+  </w:num>
+  <w:num w:numId="10" w16cid:durableId="426582660">
+    <w:abstractNumId w:val="7"/>
+  </w:num>
+  <w:num w:numId="11" w16cid:durableId="1157459587">
+    <w:abstractNumId w:val="8"/>
   </w:num>
 </w:numbering>
 </file>
@@ -4080,7 +5864,6 @@
   <w:style w:type="character" w:default="1" w:styleId="Fuentedeprrafopredeter">
     <w:name w:val="Default Paragraph Font"/>
     <w:uiPriority w:val="1"/>
-    <w:semiHidden/>
     <w:unhideWhenUsed/>
   </w:style>
   <w:style w:type="table" w:default="1" w:styleId="Tablanormal">
@@ -4713,21 +6496,6 @@
 </file>
 
 <file path=customXml/item1.xml><?xml version="1.0" encoding="utf-8"?>
-<p:properties xmlns:p="http://schemas.microsoft.com/office/2006/metadata/properties" xmlns:xsi="http://www.w3.org/2001/XMLSchema-instance" xmlns:pc="http://schemas.microsoft.com/office/infopath/2007/PartnerControls">
-  <documentManagement/>
-</p:properties>
-</file>
-
-<file path=customXml/item2.xml><?xml version="1.0" encoding="utf-8"?>
-<?mso-contentType ?>
-<FormTemplates xmlns="http://schemas.microsoft.com/sharepoint/v3/contenttype/forms">
-  <Display>DocumentLibraryForm</Display>
-  <Edit>DocumentLibraryForm</Edit>
-  <New>DocumentLibraryForm</New>
-</FormTemplates>
-</file>
-
-<file path=customXml/item3.xml><?xml version="1.0" encoding="utf-8"?>
 <ct:contentTypeSchema xmlns:ct="http://schemas.microsoft.com/office/2006/metadata/contentType" xmlns:ma="http://schemas.microsoft.com/office/2006/metadata/properties/metaAttributes" ct:_="" ma:_="" ma:contentTypeName="Document" ma:contentTypeID="0x0101008584C7DAE84023499B033D47ECE9AFC4" ma:contentTypeVersion="5" ma:contentTypeDescription="Create a new document." ma:contentTypeScope="" ma:versionID="55ff508cabb2fc970a93c917bfa82a39">
   <xsd:schema xmlns:xsd="http://www.w3.org/2001/XMLSchema" xmlns:xs="http://www.w3.org/2001/XMLSchema" xmlns:p="http://schemas.microsoft.com/office/2006/metadata/properties" xmlns:ns3="00df2e51-ebce-47a1-9626-5022bd42572f" targetNamespace="http://schemas.microsoft.com/office/2006/metadata/properties" ma:root="true" ma:fieldsID="82f64cecf33d5505168ecd3af3d0d660" ns3:_="">
     <xsd:import namespace="00df2e51-ebce-47a1-9626-5022bd42572f"/>
@@ -4877,24 +6645,22 @@
 </ct:contentTypeSchema>
 </file>
 
-<file path=customXml/itemProps1.xml><?xml version="1.0" encoding="utf-8"?>
-<ds:datastoreItem xmlns:ds="http://schemas.openxmlformats.org/officeDocument/2006/customXml" ds:itemID="{CBC629ED-4CF3-4529-ABC6-62F0BC41C5D2}">
-  <ds:schemaRefs>
-    <ds:schemaRef ds:uri="http://schemas.microsoft.com/office/2006/metadata/properties"/>
-    <ds:schemaRef ds:uri="http://schemas.microsoft.com/office/infopath/2007/PartnerControls"/>
-  </ds:schemaRefs>
-</ds:datastoreItem>
+<file path=customXml/item2.xml><?xml version="1.0" encoding="utf-8"?>
+<?mso-contentType ?>
+<FormTemplates xmlns="http://schemas.microsoft.com/sharepoint/v3/contenttype/forms">
+  <Display>DocumentLibraryForm</Display>
+  <Edit>DocumentLibraryForm</Edit>
+  <New>DocumentLibraryForm</New>
+</FormTemplates>
 </file>
 
-<file path=customXml/itemProps2.xml><?xml version="1.0" encoding="utf-8"?>
-<ds:datastoreItem xmlns:ds="http://schemas.openxmlformats.org/officeDocument/2006/customXml" ds:itemID="{68D20D17-F1C0-4353-B694-192359314835}">
-  <ds:schemaRefs>
-    <ds:schemaRef ds:uri="http://schemas.microsoft.com/sharepoint/v3/contenttype/forms"/>
-  </ds:schemaRefs>
-</ds:datastoreItem>
+<file path=customXml/item3.xml><?xml version="1.0" encoding="utf-8"?>
+<p:properties xmlns:p="http://schemas.microsoft.com/office/2006/metadata/properties" xmlns:xsi="http://www.w3.org/2001/XMLSchema-instance" xmlns:pc="http://schemas.microsoft.com/office/infopath/2007/PartnerControls">
+  <documentManagement/>
+</p:properties>
 </file>
 
-<file path=customXml/itemProps3.xml><?xml version="1.0" encoding="utf-8"?>
+<file path=customXml/itemProps1.xml><?xml version="1.0" encoding="utf-8"?>
 <ds:datastoreItem xmlns:ds="http://schemas.openxmlformats.org/officeDocument/2006/customXml" ds:itemID="{5A9F8FCE-8802-437B-8A62-396490BA1478}">
   <ds:schemaRefs>
     <ds:schemaRef ds:uri="http://schemas.microsoft.com/office/2006/metadata/contentType"/>
@@ -4910,4 +6676,21 @@
     <ds:schemaRef ds:uri="http://schemas.microsoft.com/internal/obd"/>
   </ds:schemaRefs>
 </ds:datastoreItem>
+</file>
+
+<file path=customXml/itemProps2.xml><?xml version="1.0" encoding="utf-8"?>
+<ds:datastoreItem xmlns:ds="http://schemas.openxmlformats.org/officeDocument/2006/customXml" ds:itemID="{68D20D17-F1C0-4353-B694-192359314835}">
+  <ds:schemaRefs>
+    <ds:schemaRef ds:uri="http://schemas.microsoft.com/sharepoint/v3/contenttype/forms"/>
+  </ds:schemaRefs>
+</ds:datastoreItem>
+</file>
+
+<file path=customXml/itemProps3.xml><?xml version="1.0" encoding="utf-8"?>
+<ds:datastoreItem xmlns:ds="http://schemas.openxmlformats.org/officeDocument/2006/customXml" ds:itemID="{CBC629ED-4CF3-4529-ABC6-62F0BC41C5D2}">
+  <ds:schemaRefs>
+    <ds:schemaRef ds:uri="http://schemas.microsoft.com/office/2006/metadata/properties"/>
+    <ds:schemaRef ds:uri="http://schemas.microsoft.com/office/infopath/2007/PartnerControls"/>
+  </ds:schemaRefs>
+</ds:datastoreItem>
 </file>
</xml_diff>